<commit_message>
Add project architecture diagram and auto-number figures
The paper had a diagram of the scoring path but none of the project itself.
Figure 1 is now a layered view of the whole system: the three interfaces over
one scoring module, the evaluation harness and data pipeline beneath it, and a
cross-cutting column for the orchestrator, the test suite and the figure
generators. It opens Section III, so the reader sees the system before the
scoring detail; the detection pipeline follows as Figure 2.

Figure numbering in the document is now derived from document order rather
than written into each caption. Inserting this diagram renumbered six later
figures, which is exactly the edit that had already produced a duplicate
"Fig. 3" once; the counter removes that failure mode. Numbering is asserted
sequential after each build.

Co-Authored-By: Claude Opus 5 <noreply@anthropic.com>
Claude-Session: https://claude.ai/code/session_01LRh4bVua37xGFJ6kCX9Axo
</commit_message>
<xml_diff>
--- a/paper/phishing_paper_draft.docx
+++ b/paper/phishing_paper_draft.docx
@@ -547,21 +547,6 @@
     </w:p>
     <w:p>
       <w:pPr>
-        <w:spacing w:after="80" w:before="160"/>
-      </w:pPr>
-      <w:r>
-        <w:rPr>
-          <w:rFonts w:ascii="Times New Roman" w:cs="Times New Roman" w:eastAsia="Times New Roman" w:hAnsi="Times New Roman"/>
-          <w:i/>
-          <w:iCs/>
-          <w:sz w:val="20"/>
-          <w:szCs w:val="20"/>
-        </w:rPr>
-        <w:t xml:space="preserve">A.  Scoring function</w:t>
-      </w:r>
-    </w:p>
-    <w:p>
-      <w:pPr>
         <w:spacing w:after="80"/>
         <w:jc w:val="both"/>
       </w:pPr>
@@ -571,23 +556,7 @@
           <w:sz w:val="20"/>
           <w:szCs w:val="20"/>
         </w:rPr>
-        <w:t xml:space="preserve">The detector maps a URL to a bounded integer score. Each rule that matches contributes a fixed weight, weights are summed, and the total is clamped to a maximum of 100:</w:t>
-      </w:r>
-    </w:p>
-    <w:p>
-      <w:pPr>
-        <w:spacing w:after="100" w:before="100"/>
-        <w:jc w:val="center"/>
-      </w:pPr>
-      <w:r>
-        <w:rPr>
-          <w:rFonts w:ascii="Times New Roman" w:cs="Times New Roman" w:eastAsia="Times New Roman" w:hAnsi="Times New Roman"/>
-          <w:i/>
-          <w:iCs/>
-          <w:sz w:val="20"/>
-          <w:szCs w:val="20"/>
-        </w:rPr>
-        <w:t xml:space="preserve">S(u) = min( Σ wᵢ · δᵢ(u),  100 )</w:t>
+        <w:t xml:space="preserve">The system is organised in four layers over a shared test suite (Fig. 1). Every interface calls one scoring module, so a URL receives one verdict whichever front-end asked; the dataset pipeline and evaluation harness sit beneath it and are exercised by the same tests.</w:t>
       </w:r>
     </w:p>
     <w:p>
@@ -598,7 +567,7 @@
       <w:r>
         <w:drawing>
           <wp:inline distT="0" distB="0" distL="0" distR="0">
-            <wp:extent cx="2857500" cy="2743200"/>
+            <wp:extent cx="3276600" cy="3895725"/>
             <wp:effectExtent t="0" r="0" b="0" l="0"/>
             <wp:docPr id="1" name="" descr="" title=""/>
             <wp:cNvGraphicFramePr>
@@ -623,7 +592,7 @@
                   <pic:spPr bwMode="auto">
                     <a:xfrm>
                       <a:off x="0" y="0"/>
-                      <a:ext cx="2857500" cy="2743200"/>
+                      <a:ext cx="3276600" cy="3895725"/>
                     </a:xfrm>
                     <a:prstGeom prst="rect">
                       <a:avLst/>
@@ -647,7 +616,22 @@
           <w:sz w:val="16"/>
           <w:szCs w:val="16"/>
         </w:rPr>
-        <w:t xml:space="preserve">Fig. 1.  Detection pipeline. Lexical and structural rules contribute weights to a single bounded score, which is banded and returned together with the identity of every rule that fired.</w:t>
+        <w:t xml:space="preserve">Fig. 1.  Project architecture. Every interface calls one scoring module, so a URL has one verdict whichever front-end asked. The data pipeline and the evaluation harness sit below it and are exercised by the same test suite; the cross-cutting column attaches to every layer and is owned by none.</w:t>
+      </w:r>
+    </w:p>
+    <w:p>
+      <w:pPr>
+        <w:spacing w:after="80" w:before="160"/>
+      </w:pPr>
+      <w:r>
+        <w:rPr>
+          <w:rFonts w:ascii="Times New Roman" w:cs="Times New Roman" w:eastAsia="Times New Roman" w:hAnsi="Times New Roman"/>
+          <w:i/>
+          <w:iCs/>
+          <w:sz w:val="20"/>
+          <w:szCs w:val="20"/>
+        </w:rPr>
+        <w:t xml:space="preserve">A.  Scoring function</w:t>
       </w:r>
     </w:p>
     <w:p>
@@ -661,12 +645,13 @@
           <w:sz w:val="20"/>
           <w:szCs w:val="20"/>
         </w:rPr>
-        <w:t xml:space="preserve">where δᵢ(u) is 1 when rule i fires on URL u and 0 otherwise, and wᵢ is that rule's weight. The formulation is intentionally additive and monotone: no rule can reduce another's contribution, so the effect of any single term on the outcome is inspectable in isolation. Both the clamped score and the unclamped sum are retained, the latter so that the reported weights always reconcile with the total.</w:t>
-      </w:r>
-    </w:p>
-    <w:p>
-      <w:pPr>
-        <w:spacing w:after="80" w:before="160"/>
+        <w:t xml:space="preserve">The detector maps a URL to a bounded integer score. Each rule that matches contributes a fixed weight, weights are summed, and the total is clamped to a maximum of 100:</w:t>
+      </w:r>
+    </w:p>
+    <w:p>
+      <w:pPr>
+        <w:spacing w:after="100" w:before="100"/>
+        <w:jc w:val="center"/>
       </w:pPr>
       <w:r>
         <w:rPr>
@@ -676,1114 +661,7 @@
           <w:sz w:val="20"/>
           <w:szCs w:val="20"/>
         </w:rPr>
-        <w:t xml:space="preserve">B.  Multilingual vocabulary</w:t>
-      </w:r>
-    </w:p>
-    <w:p>
-      <w:pPr>
-        <w:spacing w:after="80"/>
-        <w:jc w:val="both"/>
-      </w:pPr>
-      <w:r>
-        <w:rPr>
-          <w:rFonts w:ascii="Times New Roman" w:cs="Times New Roman" w:eastAsia="Times New Roman" w:hAnsi="Times New Roman"/>
-          <w:sz w:val="20"/>
-          <w:szCs w:val="20"/>
-        </w:rPr>
-        <w:t xml:space="preserve">The lexical component matches a 33-term vocabulary of transliterated phishing lures across four languages. Terms were selected for semantic roles that recur in phishing lures: account, verification, security, urgency and financial instruments. Each matched term contributes a weight of 10. The vocabulary is deduplicated, so a term shared between languages, such as khata and suraksha in Hindi and Telugu, contributes once rather than twice.</w:t>
-      </w:r>
-    </w:p>
-    <w:p>
-      <w:pPr>
-        <w:spacing w:after="0" w:before="140"/>
-        <w:jc w:val="center"/>
-      </w:pPr>
-      <w:r>
-        <w:rPr>
-          <w:rFonts w:ascii="Times New Roman" w:cs="Times New Roman" w:eastAsia="Times New Roman" w:hAnsi="Times New Roman"/>
-          <w:sz w:val="16"/>
-          <w:szCs w:val="16"/>
-        </w:rPr>
-        <w:t xml:space="preserve">TABLE I</w:t>
-      </w:r>
-    </w:p>
-    <w:p>
-      <w:pPr>
-        <w:spacing w:after="60" w:before="0"/>
-        <w:jc w:val="center"/>
-      </w:pPr>
-      <w:r>
-        <w:rPr>
-          <w:rFonts w:ascii="Times New Roman" w:cs="Times New Roman" w:eastAsia="Times New Roman" w:hAnsi="Times New Roman"/>
-          <w:smallCaps/>
-          <w:sz w:val="16"/>
-          <w:szCs w:val="16"/>
-        </w:rPr>
-        <w:t xml:space="preserve">Multilingual Phishing Vocabulary</w:t>
-      </w:r>
-    </w:p>
-    <w:tbl>
-      <w:tblPr>
-        <w:tblW w:type="dxa" w:w="5230"/>
-        <w:tblBorders>
-          <w:top w:val="single" w:color="000000" w:sz="4"/>
-          <w:left w:val="none"/>
-          <w:bottom w:val="single" w:color="000000" w:sz="4"/>
-          <w:right w:val="none"/>
-          <w:insideH w:val="single" w:color="999999" w:sz="2"/>
-          <w:insideV w:val="none"/>
-        </w:tblBorders>
-      </w:tblPr>
-      <w:tblGrid>
-        <w:gridCol w:w="960"/>
-        <w:gridCol w:w="400"/>
-        <w:gridCol w:w="3870"/>
-      </w:tblGrid>
-      <w:tr>
-        <w:trPr>
-          <w:tblHeader/>
-        </w:trPr>
-        <w:tc>
-          <w:tcPr>
-            <w:tcW w:type="dxa" w:w="960"/>
-            <w:shd w:fill="E8E8E8" w:color="auto" w:val="clear"/>
-            <w:tcMar>
-              <w:top w:type="dxa" w:w="40"/>
-              <w:left w:type="dxa" w:w="80"/>
-              <w:bottom w:type="dxa" w:w="40"/>
-              <w:right w:type="dxa" w:w="80"/>
-            </w:tcMar>
-          </w:tcPr>
-          <w:p>
-            <w:pPr>
-              <w:jc w:val="left"/>
-            </w:pPr>
-            <w:r>
-              <w:rPr>
-                <w:rFonts w:ascii="Times New Roman" w:cs="Times New Roman" w:eastAsia="Times New Roman" w:hAnsi="Times New Roman"/>
-                <w:b/>
-                <w:bCs/>
-                <w:i w:val="false"/>
-                <w:iCs w:val="false"/>
-                <w:sz w:val="16"/>
-                <w:szCs w:val="16"/>
-              </w:rPr>
-              <w:t xml:space="preserve">Language</w:t>
-            </w:r>
-          </w:p>
-        </w:tc>
-        <w:tc>
-          <w:tcPr>
-            <w:tcW w:type="dxa" w:w="400"/>
-            <w:shd w:fill="E8E8E8" w:color="auto" w:val="clear"/>
-            <w:tcMar>
-              <w:top w:type="dxa" w:w="40"/>
-              <w:left w:type="dxa" w:w="80"/>
-              <w:bottom w:type="dxa" w:w="40"/>
-              <w:right w:type="dxa" w:w="80"/>
-            </w:tcMar>
-          </w:tcPr>
-          <w:p>
-            <w:pPr>
-              <w:jc w:val="center"/>
-            </w:pPr>
-            <w:r>
-              <w:rPr>
-                <w:rFonts w:ascii="Times New Roman" w:cs="Times New Roman" w:eastAsia="Times New Roman" w:hAnsi="Times New Roman"/>
-                <w:b/>
-                <w:bCs/>
-                <w:i w:val="false"/>
-                <w:iCs w:val="false"/>
-                <w:sz w:val="16"/>
-                <w:szCs w:val="16"/>
-              </w:rPr>
-              <w:t xml:space="preserve">n</w:t>
-            </w:r>
-          </w:p>
-        </w:tc>
-        <w:tc>
-          <w:tcPr>
-            <w:tcW w:type="dxa" w:w="3870"/>
-            <w:shd w:fill="E8E8E8" w:color="auto" w:val="clear"/>
-            <w:tcMar>
-              <w:top w:type="dxa" w:w="40"/>
-              <w:left w:type="dxa" w:w="80"/>
-              <w:bottom w:type="dxa" w:w="40"/>
-              <w:right w:type="dxa" w:w="80"/>
-            </w:tcMar>
-          </w:tcPr>
-          <w:p>
-            <w:pPr>
-              <w:jc w:val="left"/>
-            </w:pPr>
-            <w:r>
-              <w:rPr>
-                <w:rFonts w:ascii="Times New Roman" w:cs="Times New Roman" w:eastAsia="Times New Roman" w:hAnsi="Times New Roman"/>
-                <w:b/>
-                <w:bCs/>
-                <w:i w:val="false"/>
-                <w:iCs w:val="false"/>
-                <w:sz w:val="16"/>
-                <w:szCs w:val="16"/>
-              </w:rPr>
-              <w:t xml:space="preserve">Terms</w:t>
-            </w:r>
-          </w:p>
-        </w:tc>
-      </w:tr>
-      <w:tr>
-        <w:trPr>
-          <w:tblHeader w:val="false"/>
-        </w:trPr>
-        <w:tc>
-          <w:tcPr>
-            <w:tcW w:type="dxa" w:w="960"/>
-            <w:tcMar>
-              <w:top w:type="dxa" w:w="40"/>
-              <w:left w:type="dxa" w:w="80"/>
-              <w:bottom w:type="dxa" w:w="40"/>
-              <w:right w:type="dxa" w:w="80"/>
-            </w:tcMar>
-          </w:tcPr>
-          <w:p>
-            <w:pPr>
-              <w:jc w:val="left"/>
-            </w:pPr>
-            <w:r>
-              <w:rPr>
-                <w:rFonts w:ascii="Times New Roman" w:cs="Times New Roman" w:eastAsia="Times New Roman" w:hAnsi="Times New Roman"/>
-                <w:b w:val="false"/>
-                <w:bCs w:val="false"/>
-                <w:i w:val="false"/>
-                <w:iCs w:val="false"/>
-                <w:sz w:val="16"/>
-                <w:szCs w:val="16"/>
-              </w:rPr>
-              <w:t xml:space="preserve">English</w:t>
-            </w:r>
-          </w:p>
-        </w:tc>
-        <w:tc>
-          <w:tcPr>
-            <w:tcW w:type="dxa" w:w="400"/>
-            <w:tcMar>
-              <w:top w:type="dxa" w:w="40"/>
-              <w:left w:type="dxa" w:w="80"/>
-              <w:bottom w:type="dxa" w:w="40"/>
-              <w:right w:type="dxa" w:w="80"/>
-            </w:tcMar>
-          </w:tcPr>
-          <w:p>
-            <w:pPr>
-              <w:jc w:val="center"/>
-            </w:pPr>
-            <w:r>
-              <w:rPr>
-                <w:rFonts w:ascii="Times New Roman" w:cs="Times New Roman" w:eastAsia="Times New Roman" w:hAnsi="Times New Roman"/>
-                <w:b w:val="false"/>
-                <w:bCs w:val="false"/>
-                <w:i w:val="false"/>
-                <w:iCs w:val="false"/>
-                <w:sz w:val="16"/>
-                <w:szCs w:val="16"/>
-              </w:rPr>
-              <w:t xml:space="preserve">9</w:t>
-            </w:r>
-          </w:p>
-        </w:tc>
-        <w:tc>
-          <w:tcPr>
-            <w:tcW w:type="dxa" w:w="3870"/>
-            <w:tcMar>
-              <w:top w:type="dxa" w:w="40"/>
-              <w:left w:type="dxa" w:w="80"/>
-              <w:bottom w:type="dxa" w:w="40"/>
-              <w:right w:type="dxa" w:w="80"/>
-            </w:tcMar>
-          </w:tcPr>
-          <w:p>
-            <w:pPr>
-              <w:jc w:val="left"/>
-            </w:pPr>
-            <w:r>
-              <w:rPr>
-                <w:rFonts w:ascii="Times New Roman" w:cs="Times New Roman" w:eastAsia="Times New Roman" w:hAnsi="Times New Roman"/>
-                <w:b w:val="false"/>
-                <w:bCs w:val="false"/>
-                <w:i w:val="false"/>
-                <w:iCs w:val="false"/>
-                <w:sz w:val="16"/>
-                <w:szCs w:val="16"/>
-              </w:rPr>
-              <w:t xml:space="preserve">login, verify, secure, account, update, bank, otp, signin, password</w:t>
-            </w:r>
-          </w:p>
-        </w:tc>
-      </w:tr>
-      <w:tr>
-        <w:trPr>
-          <w:tblHeader w:val="false"/>
-        </w:trPr>
-        <w:tc>
-          <w:tcPr>
-            <w:tcW w:type="dxa" w:w="960"/>
-            <w:tcMar>
-              <w:top w:type="dxa" w:w="40"/>
-              <w:left w:type="dxa" w:w="80"/>
-              <w:bottom w:type="dxa" w:w="40"/>
-              <w:right w:type="dxa" w:w="80"/>
-            </w:tcMar>
-          </w:tcPr>
-          <w:p>
-            <w:pPr>
-              <w:jc w:val="left"/>
-            </w:pPr>
-            <w:r>
-              <w:rPr>
-                <w:rFonts w:ascii="Times New Roman" w:cs="Times New Roman" w:eastAsia="Times New Roman" w:hAnsi="Times New Roman"/>
-                <w:b w:val="false"/>
-                <w:bCs w:val="false"/>
-                <w:i w:val="false"/>
-                <w:iCs w:val="false"/>
-                <w:sz w:val="16"/>
-                <w:szCs w:val="16"/>
-              </w:rPr>
-              <w:t xml:space="preserve">Hindi</w:t>
-            </w:r>
-          </w:p>
-        </w:tc>
-        <w:tc>
-          <w:tcPr>
-            <w:tcW w:type="dxa" w:w="400"/>
-            <w:tcMar>
-              <w:top w:type="dxa" w:w="40"/>
-              <w:left w:type="dxa" w:w="80"/>
-              <w:bottom w:type="dxa" w:w="40"/>
-              <w:right w:type="dxa" w:w="80"/>
-            </w:tcMar>
-          </w:tcPr>
-          <w:p>
-            <w:pPr>
-              <w:jc w:val="center"/>
-            </w:pPr>
-            <w:r>
-              <w:rPr>
-                <w:rFonts w:ascii="Times New Roman" w:cs="Times New Roman" w:eastAsia="Times New Roman" w:hAnsi="Times New Roman"/>
-                <w:b w:val="false"/>
-                <w:bCs w:val="false"/>
-                <w:i w:val="false"/>
-                <w:iCs w:val="false"/>
-                <w:sz w:val="16"/>
-                <w:szCs w:val="16"/>
-              </w:rPr>
-              <w:t xml:space="preserve">11</w:t>
-            </w:r>
-          </w:p>
-        </w:tc>
-        <w:tc>
-          <w:tcPr>
-            <w:tcW w:type="dxa" w:w="3870"/>
-            <w:tcMar>
-              <w:top w:type="dxa" w:w="40"/>
-              <w:left w:type="dxa" w:w="80"/>
-              <w:bottom w:type="dxa" w:w="40"/>
-              <w:right w:type="dxa" w:w="80"/>
-            </w:tcMar>
-          </w:tcPr>
-          <w:p>
-            <w:pPr>
-              <w:jc w:val="left"/>
-            </w:pPr>
-            <w:r>
-              <w:rPr>
-                <w:rFonts w:ascii="Times New Roman" w:cs="Times New Roman" w:eastAsia="Times New Roman" w:hAnsi="Times New Roman"/>
-                <w:b w:val="false"/>
-                <w:bCs w:val="false"/>
-                <w:i w:val="false"/>
-                <w:iCs w:val="false"/>
-                <w:sz w:val="16"/>
-                <w:szCs w:val="16"/>
-              </w:rPr>
-              <w:t xml:space="preserve">kyc, aadhaar, pan, banking, verifyotp, suraksha, khata, jaanch, satyapan, turant, seva</w:t>
-            </w:r>
-          </w:p>
-        </w:tc>
-      </w:tr>
-      <w:tr>
-        <w:trPr>
-          <w:tblHeader w:val="false"/>
-        </w:trPr>
-        <w:tc>
-          <w:tcPr>
-            <w:tcW w:type="dxa" w:w="960"/>
-            <w:tcMar>
-              <w:top w:type="dxa" w:w="40"/>
-              <w:left w:type="dxa" w:w="80"/>
-              <w:bottom w:type="dxa" w:w="40"/>
-              <w:right w:type="dxa" w:w="80"/>
-            </w:tcMar>
-          </w:tcPr>
-          <w:p>
-            <w:pPr>
-              <w:jc w:val="left"/>
-            </w:pPr>
-            <w:r>
-              <w:rPr>
-                <w:rFonts w:ascii="Times New Roman" w:cs="Times New Roman" w:eastAsia="Times New Roman" w:hAnsi="Times New Roman"/>
-                <w:b w:val="false"/>
-                <w:bCs w:val="false"/>
-                <w:i w:val="false"/>
-                <w:iCs w:val="false"/>
-                <w:sz w:val="16"/>
-                <w:szCs w:val="16"/>
-              </w:rPr>
-              <w:t xml:space="preserve">Tamil</w:t>
-            </w:r>
-          </w:p>
-        </w:tc>
-        <w:tc>
-          <w:tcPr>
-            <w:tcW w:type="dxa" w:w="400"/>
-            <w:tcMar>
-              <w:top w:type="dxa" w:w="40"/>
-              <w:left w:type="dxa" w:w="80"/>
-              <w:bottom w:type="dxa" w:w="40"/>
-              <w:right w:type="dxa" w:w="80"/>
-            </w:tcMar>
-          </w:tcPr>
-          <w:p>
-            <w:pPr>
-              <w:jc w:val="center"/>
-            </w:pPr>
-            <w:r>
-              <w:rPr>
-                <w:rFonts w:ascii="Times New Roman" w:cs="Times New Roman" w:eastAsia="Times New Roman" w:hAnsi="Times New Roman"/>
-                <w:b w:val="false"/>
-                <w:bCs w:val="false"/>
-                <w:i w:val="false"/>
-                <w:iCs w:val="false"/>
-                <w:sz w:val="16"/>
-                <w:szCs w:val="16"/>
-              </w:rPr>
-              <w:t xml:space="preserve">9</w:t>
-            </w:r>
-          </w:p>
-        </w:tc>
-        <w:tc>
-          <w:tcPr>
-            <w:tcW w:type="dxa" w:w="3870"/>
-            <w:tcMar>
-              <w:top w:type="dxa" w:w="40"/>
-              <w:left w:type="dxa" w:w="80"/>
-              <w:bottom w:type="dxa" w:w="40"/>
-              <w:right w:type="dxa" w:w="80"/>
-            </w:tcMar>
-          </w:tcPr>
-          <w:p>
-            <w:pPr>
-              <w:jc w:val="left"/>
-            </w:pPr>
-            <w:r>
-              <w:rPr>
-                <w:rFonts w:ascii="Times New Roman" w:cs="Times New Roman" w:eastAsia="Times New Roman" w:hAnsi="Times New Roman"/>
-                <w:b w:val="false"/>
-                <w:bCs w:val="false"/>
-                <w:i w:val="false"/>
-                <w:iCs w:val="false"/>
-                <w:sz w:val="16"/>
-                <w:szCs w:val="16"/>
-              </w:rPr>
-              <w:t xml:space="preserve">vangi, kanakku, urudhi, puduppi, paathukaappu, seyal, udanadi, otpverify, bankupdate</w:t>
-            </w:r>
-          </w:p>
-        </w:tc>
-      </w:tr>
-      <w:tr>
-        <w:trPr>
-          <w:tblHeader w:val="false"/>
-        </w:trPr>
-        <w:tc>
-          <w:tcPr>
-            <w:tcW w:type="dxa" w:w="960"/>
-            <w:tcMar>
-              <w:top w:type="dxa" w:w="40"/>
-              <w:left w:type="dxa" w:w="80"/>
-              <w:bottom w:type="dxa" w:w="40"/>
-              <w:right w:type="dxa" w:w="80"/>
-            </w:tcMar>
-          </w:tcPr>
-          <w:p>
-            <w:pPr>
-              <w:jc w:val="left"/>
-            </w:pPr>
-            <w:r>
-              <w:rPr>
-                <w:rFonts w:ascii="Times New Roman" w:cs="Times New Roman" w:eastAsia="Times New Roman" w:hAnsi="Times New Roman"/>
-                <w:b w:val="false"/>
-                <w:bCs w:val="false"/>
-                <w:i w:val="false"/>
-                <w:iCs w:val="false"/>
-                <w:sz w:val="16"/>
-                <w:szCs w:val="16"/>
-              </w:rPr>
-              <w:t xml:space="preserve">Telugu</w:t>
-            </w:r>
-          </w:p>
-        </w:tc>
-        <w:tc>
-          <w:tcPr>
-            <w:tcW w:type="dxa" w:w="400"/>
-            <w:tcMar>
-              <w:top w:type="dxa" w:w="40"/>
-              <w:left w:type="dxa" w:w="80"/>
-              <w:bottom w:type="dxa" w:w="40"/>
-              <w:right w:type="dxa" w:w="80"/>
-            </w:tcMar>
-          </w:tcPr>
-          <w:p>
-            <w:pPr>
-              <w:jc w:val="center"/>
-            </w:pPr>
-            <w:r>
-              <w:rPr>
-                <w:rFonts w:ascii="Times New Roman" w:cs="Times New Roman" w:eastAsia="Times New Roman" w:hAnsi="Times New Roman"/>
-                <w:b w:val="false"/>
-                <w:bCs w:val="false"/>
-                <w:i w:val="false"/>
-                <w:iCs w:val="false"/>
-                <w:sz w:val="16"/>
-                <w:szCs w:val="16"/>
-              </w:rPr>
-              <w:t xml:space="preserve">4</w:t>
-            </w:r>
-          </w:p>
-        </w:tc>
-        <w:tc>
-          <w:tcPr>
-            <w:tcW w:type="dxa" w:w="3870"/>
-            <w:tcMar>
-              <w:top w:type="dxa" w:w="40"/>
-              <w:left w:type="dxa" w:w="80"/>
-              <w:bottom w:type="dxa" w:w="40"/>
-              <w:right w:type="dxa" w:w="80"/>
-            </w:tcMar>
-          </w:tcPr>
-          <w:p>
-            <w:pPr>
-              <w:jc w:val="left"/>
-            </w:pPr>
-            <w:r>
-              <w:rPr>
-                <w:rFonts w:ascii="Times New Roman" w:cs="Times New Roman" w:eastAsia="Times New Roman" w:hAnsi="Times New Roman"/>
-                <w:b w:val="false"/>
-                <w:bCs w:val="false"/>
-                <w:i w:val="false"/>
-                <w:iCs w:val="false"/>
-                <w:sz w:val="16"/>
-                <w:szCs w:val="16"/>
-              </w:rPr>
-              <w:t xml:space="preserve">dhruvikarinchu, vaddi, runam, podupukhata</w:t>
-            </w:r>
-          </w:p>
-        </w:tc>
-      </w:tr>
-    </w:tbl>
-    <w:p>
-      <w:pPr>
-        <w:spacing w:after="80" w:before="160"/>
-      </w:pPr>
-      <w:r>
-        <w:rPr>
-          <w:rFonts w:ascii="Times New Roman" w:cs="Times New Roman" w:eastAsia="Times New Roman" w:hAnsi="Times New Roman"/>
-          <w:i/>
-          <w:iCs/>
-          <w:sz w:val="20"/>
-          <w:szCs w:val="20"/>
-        </w:rPr>
-        <w:t xml:space="preserve">C.  Structural rules</w:t>
-      </w:r>
-    </w:p>
-    <w:p>
-      <w:pPr>
-        <w:spacing w:after="80"/>
-        <w:jc w:val="both"/>
-      </w:pPr>
-      <w:r>
-        <w:rPr>
-          <w:rFonts w:ascii="Times New Roman" w:cs="Times New Roman" w:eastAsia="Times New Roman" w:hAnsi="Times New Roman"/>
-          <w:sz w:val="20"/>
-          <w:szCs w:val="20"/>
-        </w:rPr>
-        <w:t xml:space="preserve">Four structural indicators complement the vocabulary. Their weights and thresholds are given in Table II. The at-sign carries double weight because, in a URL, everything preceding it in the authority component is discarded by the browser, making it a direct mechanism for disguising the true host rather than a statistical correlate of one.</w:t>
-      </w:r>
-    </w:p>
-    <w:p>
-      <w:pPr>
-        <w:spacing w:after="0" w:before="140"/>
-        <w:jc w:val="center"/>
-      </w:pPr>
-      <w:r>
-        <w:rPr>
-          <w:rFonts w:ascii="Times New Roman" w:cs="Times New Roman" w:eastAsia="Times New Roman" w:hAnsi="Times New Roman"/>
-          <w:sz w:val="16"/>
-          <w:szCs w:val="16"/>
-        </w:rPr>
-        <w:t xml:space="preserve">TABLE II</w:t>
-      </w:r>
-    </w:p>
-    <w:p>
-      <w:pPr>
-        <w:spacing w:after="60" w:before="0"/>
-        <w:jc w:val="center"/>
-      </w:pPr>
-      <w:r>
-        <w:rPr>
-          <w:rFonts w:ascii="Times New Roman" w:cs="Times New Roman" w:eastAsia="Times New Roman" w:hAnsi="Times New Roman"/>
-          <w:smallCaps/>
-          <w:sz w:val="16"/>
-          <w:szCs w:val="16"/>
-        </w:rPr>
-        <w:t xml:space="preserve">Rule Weights and Thresholds</w:t>
-      </w:r>
-    </w:p>
-    <w:tbl>
-      <w:tblPr>
-        <w:tblW w:type="dxa" w:w="5230"/>
-        <w:tblBorders>
-          <w:top w:val="single" w:color="000000" w:sz="4"/>
-          <w:left w:val="none"/>
-          <w:bottom w:val="single" w:color="000000" w:sz="4"/>
-          <w:right w:val="none"/>
-          <w:insideH w:val="single" w:color="999999" w:sz="2"/>
-          <w:insideV w:val="none"/>
-        </w:tblBorders>
-      </w:tblPr>
-      <w:tblGrid>
-        <w:gridCol w:w="1450"/>
-        <w:gridCol w:w="2490"/>
-        <w:gridCol w:w="1290"/>
-      </w:tblGrid>
-      <w:tr>
-        <w:trPr>
-          <w:tblHeader/>
-        </w:trPr>
-        <w:tc>
-          <w:tcPr>
-            <w:tcW w:type="dxa" w:w="1450"/>
-            <w:shd w:fill="E8E8E8" w:color="auto" w:val="clear"/>
-            <w:tcMar>
-              <w:top w:type="dxa" w:w="40"/>
-              <w:left w:type="dxa" w:w="80"/>
-              <w:bottom w:type="dxa" w:w="40"/>
-              <w:right w:type="dxa" w:w="80"/>
-            </w:tcMar>
-          </w:tcPr>
-          <w:p>
-            <w:pPr>
-              <w:jc w:val="left"/>
-            </w:pPr>
-            <w:r>
-              <w:rPr>
-                <w:rFonts w:ascii="Times New Roman" w:cs="Times New Roman" w:eastAsia="Times New Roman" w:hAnsi="Times New Roman"/>
-                <w:b/>
-                <w:bCs/>
-                <w:i w:val="false"/>
-                <w:iCs w:val="false"/>
-                <w:sz w:val="16"/>
-                <w:szCs w:val="16"/>
-              </w:rPr>
-              <w:t xml:space="preserve">Rule</w:t>
-            </w:r>
-          </w:p>
-        </w:tc>
-        <w:tc>
-          <w:tcPr>
-            <w:tcW w:type="dxa" w:w="2490"/>
-            <w:shd w:fill="E8E8E8" w:color="auto" w:val="clear"/>
-            <w:tcMar>
-              <w:top w:type="dxa" w:w="40"/>
-              <w:left w:type="dxa" w:w="80"/>
-              <w:bottom w:type="dxa" w:w="40"/>
-              <w:right w:type="dxa" w:w="80"/>
-            </w:tcMar>
-          </w:tcPr>
-          <w:p>
-            <w:pPr>
-              <w:jc w:val="left"/>
-            </w:pPr>
-            <w:r>
-              <w:rPr>
-                <w:rFonts w:ascii="Times New Roman" w:cs="Times New Roman" w:eastAsia="Times New Roman" w:hAnsi="Times New Roman"/>
-                <w:b/>
-                <w:bCs/>
-                <w:i w:val="false"/>
-                <w:iCs w:val="false"/>
-                <w:sz w:val="16"/>
-                <w:szCs w:val="16"/>
-              </w:rPr>
-              <w:t xml:space="preserve">Condition</w:t>
-            </w:r>
-          </w:p>
-        </w:tc>
-        <w:tc>
-          <w:tcPr>
-            <w:tcW w:type="dxa" w:w="1290"/>
-            <w:shd w:fill="E8E8E8" w:color="auto" w:val="clear"/>
-            <w:tcMar>
-              <w:top w:type="dxa" w:w="40"/>
-              <w:left w:type="dxa" w:w="80"/>
-              <w:bottom w:type="dxa" w:w="40"/>
-              <w:right w:type="dxa" w:w="80"/>
-            </w:tcMar>
-          </w:tcPr>
-          <w:p>
-            <w:pPr>
-              <w:jc w:val="center"/>
-            </w:pPr>
-            <w:r>
-              <w:rPr>
-                <w:rFonts w:ascii="Times New Roman" w:cs="Times New Roman" w:eastAsia="Times New Roman" w:hAnsi="Times New Roman"/>
-                <w:b/>
-                <w:bCs/>
-                <w:i w:val="false"/>
-                <w:iCs w:val="false"/>
-                <w:sz w:val="16"/>
-                <w:szCs w:val="16"/>
-              </w:rPr>
-              <w:t xml:space="preserve">Weight</w:t>
-            </w:r>
-          </w:p>
-        </w:tc>
-      </w:tr>
-      <w:tr>
-        <w:trPr>
-          <w:tblHeader w:val="false"/>
-        </w:trPr>
-        <w:tc>
-          <w:tcPr>
-            <w:tcW w:type="dxa" w:w="1450"/>
-            <w:tcMar>
-              <w:top w:type="dxa" w:w="40"/>
-              <w:left w:type="dxa" w:w="80"/>
-              <w:bottom w:type="dxa" w:w="40"/>
-              <w:right w:type="dxa" w:w="80"/>
-            </w:tcMar>
-          </w:tcPr>
-          <w:p>
-            <w:pPr>
-              <w:jc w:val="left"/>
-            </w:pPr>
-            <w:r>
-              <w:rPr>
-                <w:rFonts w:ascii="Times New Roman" w:cs="Times New Roman" w:eastAsia="Times New Roman" w:hAnsi="Times New Roman"/>
-                <w:b w:val="false"/>
-                <w:bCs w:val="false"/>
-                <w:i w:val="false"/>
-                <w:iCs w:val="false"/>
-                <w:sz w:val="16"/>
-                <w:szCs w:val="16"/>
-              </w:rPr>
-              <w:t xml:space="preserve">keyword</w:t>
-            </w:r>
-          </w:p>
-        </w:tc>
-        <w:tc>
-          <w:tcPr>
-            <w:tcW w:type="dxa" w:w="2490"/>
-            <w:tcMar>
-              <w:top w:type="dxa" w:w="40"/>
-              <w:left w:type="dxa" w:w="80"/>
-              <w:bottom w:type="dxa" w:w="40"/>
-              <w:right w:type="dxa" w:w="80"/>
-            </w:tcMar>
-          </w:tcPr>
-          <w:p>
-            <w:pPr>
-              <w:jc w:val="left"/>
-            </w:pPr>
-            <w:r>
-              <w:rPr>
-                <w:rFonts w:ascii="Times New Roman" w:cs="Times New Roman" w:eastAsia="Times New Roman" w:hAnsi="Times New Roman"/>
-                <w:b w:val="false"/>
-                <w:bCs w:val="false"/>
-                <w:i w:val="false"/>
-                <w:iCs w:val="false"/>
-                <w:sz w:val="16"/>
-                <w:szCs w:val="16"/>
-              </w:rPr>
-              <w:t xml:space="preserve">vocabulary term present</w:t>
-            </w:r>
-          </w:p>
-        </w:tc>
-        <w:tc>
-          <w:tcPr>
-            <w:tcW w:type="dxa" w:w="1290"/>
-            <w:tcMar>
-              <w:top w:type="dxa" w:w="40"/>
-              <w:left w:type="dxa" w:w="80"/>
-              <w:bottom w:type="dxa" w:w="40"/>
-              <w:right w:type="dxa" w:w="80"/>
-            </w:tcMar>
-          </w:tcPr>
-          <w:p>
-            <w:pPr>
-              <w:jc w:val="center"/>
-            </w:pPr>
-            <w:r>
-              <w:rPr>
-                <w:rFonts w:ascii="Times New Roman" w:cs="Times New Roman" w:eastAsia="Times New Roman" w:hAnsi="Times New Roman"/>
-                <w:b w:val="false"/>
-                <w:bCs w:val="false"/>
-                <w:i w:val="false"/>
-                <w:iCs w:val="false"/>
-                <w:sz w:val="16"/>
-                <w:szCs w:val="16"/>
-              </w:rPr>
-              <w:t xml:space="preserve">10 each</w:t>
-            </w:r>
-          </w:p>
-        </w:tc>
-      </w:tr>
-      <w:tr>
-        <w:trPr>
-          <w:tblHeader w:val="false"/>
-        </w:trPr>
-        <w:tc>
-          <w:tcPr>
-            <w:tcW w:type="dxa" w:w="1450"/>
-            <w:tcMar>
-              <w:top w:type="dxa" w:w="40"/>
-              <w:left w:type="dxa" w:w="80"/>
-              <w:bottom w:type="dxa" w:w="40"/>
-              <w:right w:type="dxa" w:w="80"/>
-            </w:tcMar>
-          </w:tcPr>
-          <w:p>
-            <w:pPr>
-              <w:jc w:val="left"/>
-            </w:pPr>
-            <w:r>
-              <w:rPr>
-                <w:rFonts w:ascii="Times New Roman" w:cs="Times New Roman" w:eastAsia="Times New Roman" w:hAnsi="Times New Roman"/>
-                <w:b w:val="false"/>
-                <w:bCs w:val="false"/>
-                <w:i w:val="false"/>
-                <w:iCs w:val="false"/>
-                <w:sz w:val="16"/>
-                <w:szCs w:val="16"/>
-              </w:rPr>
-              <w:t xml:space="preserve">long_url</w:t>
-            </w:r>
-          </w:p>
-        </w:tc>
-        <w:tc>
-          <w:tcPr>
-            <w:tcW w:type="dxa" w:w="2490"/>
-            <w:tcMar>
-              <w:top w:type="dxa" w:w="40"/>
-              <w:left w:type="dxa" w:w="80"/>
-              <w:bottom w:type="dxa" w:w="40"/>
-              <w:right w:type="dxa" w:w="80"/>
-            </w:tcMar>
-          </w:tcPr>
-          <w:p>
-            <w:pPr>
-              <w:jc w:val="left"/>
-            </w:pPr>
-            <w:r>
-              <w:rPr>
-                <w:rFonts w:ascii="Times New Roman" w:cs="Times New Roman" w:eastAsia="Times New Roman" w:hAnsi="Times New Roman"/>
-                <w:b w:val="false"/>
-                <w:bCs w:val="false"/>
-                <w:i w:val="false"/>
-                <w:iCs w:val="false"/>
-                <w:sz w:val="16"/>
-                <w:szCs w:val="16"/>
-              </w:rPr>
-              <w:t xml:space="preserve">length &gt; 30 characters</w:t>
-            </w:r>
-          </w:p>
-        </w:tc>
-        <w:tc>
-          <w:tcPr>
-            <w:tcW w:type="dxa" w:w="1290"/>
-            <w:tcMar>
-              <w:top w:type="dxa" w:w="40"/>
-              <w:left w:type="dxa" w:w="80"/>
-              <w:bottom w:type="dxa" w:w="40"/>
-              <w:right w:type="dxa" w:w="80"/>
-            </w:tcMar>
-          </w:tcPr>
-          <w:p>
-            <w:pPr>
-              <w:jc w:val="center"/>
-            </w:pPr>
-            <w:r>
-              <w:rPr>
-                <w:rFonts w:ascii="Times New Roman" w:cs="Times New Roman" w:eastAsia="Times New Roman" w:hAnsi="Times New Roman"/>
-                <w:b w:val="false"/>
-                <w:bCs w:val="false"/>
-                <w:i w:val="false"/>
-                <w:iCs w:val="false"/>
-                <w:sz w:val="16"/>
-                <w:szCs w:val="16"/>
-              </w:rPr>
-              <w:t xml:space="preserve">10</w:t>
-            </w:r>
-          </w:p>
-        </w:tc>
-      </w:tr>
-      <w:tr>
-        <w:trPr>
-          <w:tblHeader w:val="false"/>
-        </w:trPr>
-        <w:tc>
-          <w:tcPr>
-            <w:tcW w:type="dxa" w:w="1450"/>
-            <w:tcMar>
-              <w:top w:type="dxa" w:w="40"/>
-              <w:left w:type="dxa" w:w="80"/>
-              <w:bottom w:type="dxa" w:w="40"/>
-              <w:right w:type="dxa" w:w="80"/>
-            </w:tcMar>
-          </w:tcPr>
-          <w:p>
-            <w:pPr>
-              <w:jc w:val="left"/>
-            </w:pPr>
-            <w:r>
-              <w:rPr>
-                <w:rFonts w:ascii="Times New Roman" w:cs="Times New Roman" w:eastAsia="Times New Roman" w:hAnsi="Times New Roman"/>
-                <w:b w:val="false"/>
-                <w:bCs w:val="false"/>
-                <w:i w:val="false"/>
-                <w:iCs w:val="false"/>
-                <w:sz w:val="16"/>
-                <w:szCs w:val="16"/>
-              </w:rPr>
-              <w:t xml:space="preserve">at_symbol</w:t>
-            </w:r>
-          </w:p>
-        </w:tc>
-        <w:tc>
-          <w:tcPr>
-            <w:tcW w:type="dxa" w:w="2490"/>
-            <w:tcMar>
-              <w:top w:type="dxa" w:w="40"/>
-              <w:left w:type="dxa" w:w="80"/>
-              <w:bottom w:type="dxa" w:w="40"/>
-              <w:right w:type="dxa" w:w="80"/>
-            </w:tcMar>
-          </w:tcPr>
-          <w:p>
-            <w:pPr>
-              <w:jc w:val="left"/>
-            </w:pPr>
-            <w:r>
-              <w:rPr>
-                <w:rFonts w:ascii="Times New Roman" w:cs="Times New Roman" w:eastAsia="Times New Roman" w:hAnsi="Times New Roman"/>
-                <w:b w:val="false"/>
-                <w:bCs w:val="false"/>
-                <w:i w:val="false"/>
-                <w:iCs w:val="false"/>
-                <w:sz w:val="16"/>
-                <w:szCs w:val="16"/>
-              </w:rPr>
-              <w:t xml:space="preserve">'@' present</w:t>
-            </w:r>
-          </w:p>
-        </w:tc>
-        <w:tc>
-          <w:tcPr>
-            <w:tcW w:type="dxa" w:w="1290"/>
-            <w:tcMar>
-              <w:top w:type="dxa" w:w="40"/>
-              <w:left w:type="dxa" w:w="80"/>
-              <w:bottom w:type="dxa" w:w="40"/>
-              <w:right w:type="dxa" w:w="80"/>
-            </w:tcMar>
-          </w:tcPr>
-          <w:p>
-            <w:pPr>
-              <w:jc w:val="center"/>
-            </w:pPr>
-            <w:r>
-              <w:rPr>
-                <w:rFonts w:ascii="Times New Roman" w:cs="Times New Roman" w:eastAsia="Times New Roman" w:hAnsi="Times New Roman"/>
-                <w:b w:val="false"/>
-                <w:bCs w:val="false"/>
-                <w:i w:val="false"/>
-                <w:iCs w:val="false"/>
-                <w:sz w:val="16"/>
-                <w:szCs w:val="16"/>
-              </w:rPr>
-              <w:t xml:space="preserve">20</w:t>
-            </w:r>
-          </w:p>
-        </w:tc>
-      </w:tr>
-      <w:tr>
-        <w:trPr>
-          <w:tblHeader w:val="false"/>
-        </w:trPr>
-        <w:tc>
-          <w:tcPr>
-            <w:tcW w:type="dxa" w:w="1450"/>
-            <w:tcMar>
-              <w:top w:type="dxa" w:w="40"/>
-              <w:left w:type="dxa" w:w="80"/>
-              <w:bottom w:type="dxa" w:w="40"/>
-              <w:right w:type="dxa" w:w="80"/>
-            </w:tcMar>
-          </w:tcPr>
-          <w:p>
-            <w:pPr>
-              <w:jc w:val="left"/>
-            </w:pPr>
-            <w:r>
-              <w:rPr>
-                <w:rFonts w:ascii="Times New Roman" w:cs="Times New Roman" w:eastAsia="Times New Roman" w:hAnsi="Times New Roman"/>
-                <w:b w:val="false"/>
-                <w:bCs w:val="false"/>
-                <w:i w:val="false"/>
-                <w:iCs w:val="false"/>
-                <w:sz w:val="16"/>
-                <w:szCs w:val="16"/>
-              </w:rPr>
-              <w:t xml:space="preserve">many_dots</w:t>
-            </w:r>
-          </w:p>
-        </w:tc>
-        <w:tc>
-          <w:tcPr>
-            <w:tcW w:type="dxa" w:w="2490"/>
-            <w:tcMar>
-              <w:top w:type="dxa" w:w="40"/>
-              <w:left w:type="dxa" w:w="80"/>
-              <w:bottom w:type="dxa" w:w="40"/>
-              <w:right w:type="dxa" w:w="80"/>
-            </w:tcMar>
-          </w:tcPr>
-          <w:p>
-            <w:pPr>
-              <w:jc w:val="left"/>
-            </w:pPr>
-            <w:r>
-              <w:rPr>
-                <w:rFonts w:ascii="Times New Roman" w:cs="Times New Roman" w:eastAsia="Times New Roman" w:hAnsi="Times New Roman"/>
-                <w:b w:val="false"/>
-                <w:bCs w:val="false"/>
-                <w:i w:val="false"/>
-                <w:iCs w:val="false"/>
-                <w:sz w:val="16"/>
-                <w:szCs w:val="16"/>
-              </w:rPr>
-              <w:t xml:space="preserve">more than 3 dots</w:t>
-            </w:r>
-          </w:p>
-        </w:tc>
-        <w:tc>
-          <w:tcPr>
-            <w:tcW w:type="dxa" w:w="1290"/>
-            <w:tcMar>
-              <w:top w:type="dxa" w:w="40"/>
-              <w:left w:type="dxa" w:w="80"/>
-              <w:bottom w:type="dxa" w:w="40"/>
-              <w:right w:type="dxa" w:w="80"/>
-            </w:tcMar>
-          </w:tcPr>
-          <w:p>
-            <w:pPr>
-              <w:jc w:val="center"/>
-            </w:pPr>
-            <w:r>
-              <w:rPr>
-                <w:rFonts w:ascii="Times New Roman" w:cs="Times New Roman" w:eastAsia="Times New Roman" w:hAnsi="Times New Roman"/>
-                <w:b w:val="false"/>
-                <w:bCs w:val="false"/>
-                <w:i w:val="false"/>
-                <w:iCs w:val="false"/>
-                <w:sz w:val="16"/>
-                <w:szCs w:val="16"/>
-              </w:rPr>
-              <w:t xml:space="preserve">10</w:t>
-            </w:r>
-          </w:p>
-        </w:tc>
-      </w:tr>
-    </w:tbl>
-    <w:p>
-      <w:pPr>
-        <w:spacing w:after="120" w:before="60"/>
-        <w:jc w:val="left"/>
-      </w:pPr>
-      <w:r>
-        <w:rPr>
-          <w:rFonts w:ascii="Times New Roman" w:cs="Times New Roman" w:eastAsia="Times New Roman" w:hAnsi="Times New Roman"/>
-          <w:i/>
-          <w:iCs/>
-          <w:sz w:val="16"/>
-          <w:szCs w:val="16"/>
-        </w:rPr>
-        <w:t xml:space="preserve">Weights are inherited unchanged from the prototype system so that the refactored detector remains behaviourally comparable to it.</w:t>
-      </w:r>
-    </w:p>
-    <w:p>
-      <w:pPr>
-        <w:spacing w:after="80" w:before="160"/>
-      </w:pPr>
-      <w:r>
-        <w:rPr>
-          <w:rFonts w:ascii="Times New Roman" w:cs="Times New Roman" w:eastAsia="Times New Roman" w:hAnsi="Times New Roman"/>
-          <w:i/>
-          <w:iCs/>
-          <w:sz w:val="20"/>
-          <w:szCs w:val="20"/>
-        </w:rPr>
-        <w:t xml:space="preserve">D.  Risk bands</w:t>
-      </w:r>
-    </w:p>
-    <w:p>
-      <w:pPr>
-        <w:spacing w:after="80"/>
-        <w:jc w:val="both"/>
-      </w:pPr>
-      <w:r>
-        <w:rPr>
-          <w:rFonts w:ascii="Times New Roman" w:cs="Times New Roman" w:eastAsia="Times New Roman" w:hAnsi="Times New Roman"/>
-          <w:sz w:val="20"/>
-          <w:szCs w:val="20"/>
-        </w:rPr>
-        <w:t xml:space="preserve">The score is mapped to three bands: Low Risk below 30, Medium Risk from 30 to 59, and High Risk at 60 and above. The High Risk boundary is the operating threshold used for binary classification in Section VI. Because the threshold is a free parameter rather than a property of the method, Section VII reports a sweep across its full range rather than defending the default in isolation.</w:t>
-      </w:r>
-    </w:p>
-    <w:p>
-      <w:pPr>
-        <w:spacing w:after="80" w:before="160"/>
-      </w:pPr>
-      <w:r>
-        <w:rPr>
-          <w:rFonts w:ascii="Times New Roman" w:cs="Times New Roman" w:eastAsia="Times New Roman" w:hAnsi="Times New Roman"/>
-          <w:i/>
-          <w:iCs/>
-          <w:sz w:val="20"/>
-          <w:szCs w:val="20"/>
-        </w:rPr>
-        <w:t xml:space="preserve">E.  Explainability</w:t>
-      </w:r>
-    </w:p>
-    <w:p>
-      <w:pPr>
-        <w:spacing w:after="80"/>
-        <w:jc w:val="both"/>
-      </w:pPr>
-      <w:r>
-        <w:rPr>
-          <w:rFonts w:ascii="Times New Roman" w:cs="Times New Roman" w:eastAsia="Times New Roman" w:hAnsi="Times New Roman"/>
-          <w:sz w:val="20"/>
-          <w:szCs w:val="20"/>
-        </w:rPr>
-        <w:t xml:space="preserve">The detector returns, alongside the score and band, the identity and weight of every rule that fired. A verdict is therefore not a bare label but an itemised account: a user sees which terms matched and what each contributed. This property is a consequence of the additive design rather than a post hoc attribution method, and it holds exactly rather than approximately.</w:t>
+        <w:t xml:space="preserve">S(u) = min( Σ wᵢ · δᵢ(u),  100 )</w:t>
       </w:r>
     </w:p>
     <w:p>
@@ -1794,7 +672,7 @@
       <w:r>
         <w:drawing>
           <wp:inline distT="0" distB="0" distL="0" distR="0">
-            <wp:extent cx="3276600" cy="2619375"/>
+            <wp:extent cx="2857500" cy="2743200"/>
             <wp:effectExtent t="0" r="0" b="0" l="0"/>
             <wp:docPr id="1" name="" descr="" title=""/>
             <wp:cNvGraphicFramePr>
@@ -1819,7 +697,7 @@
                   <pic:spPr bwMode="auto">
                     <a:xfrm>
                       <a:off x="0" y="0"/>
-                      <a:ext cx="3276600" cy="2619375"/>
+                      <a:ext cx="2857500" cy="2743200"/>
                     </a:xfrm>
                     <a:prstGeom prst="rect">
                       <a:avLst/>
@@ -1843,7 +721,1143 @@
           <w:sz w:val="16"/>
           <w:szCs w:val="16"/>
         </w:rPr>
-        <w:t xml:space="preserve">Fig. 2.  Dashboard classifying a phishing URL that combines English lures with the Hindi/Telugu terms suraksha and khata. The verdict is accompanied by every rule that fired and its weight, and those weights sum to the reported score of 90.</w:t>
+        <w:t xml:space="preserve">Fig. 2.  Detection pipeline. Lexical and structural rules contribute weights to a single bounded score, which is banded and returned together with the identity of every rule that fired.</w:t>
+      </w:r>
+    </w:p>
+    <w:p>
+      <w:pPr>
+        <w:spacing w:after="80"/>
+        <w:jc w:val="both"/>
+      </w:pPr>
+      <w:r>
+        <w:rPr>
+          <w:rFonts w:ascii="Times New Roman" w:cs="Times New Roman" w:eastAsia="Times New Roman" w:hAnsi="Times New Roman"/>
+          <w:sz w:val="20"/>
+          <w:szCs w:val="20"/>
+        </w:rPr>
+        <w:t xml:space="preserve">where δᵢ(u) is 1 when rule i fires on URL u and 0 otherwise, and wᵢ is that rule's weight. The formulation is intentionally additive and monotone: no rule can reduce another's contribution, so the effect of any single term on the outcome is inspectable in isolation. Both the clamped score and the unclamped sum are retained, the latter so that the reported weights always reconcile with the total.</w:t>
+      </w:r>
+    </w:p>
+    <w:p>
+      <w:pPr>
+        <w:spacing w:after="80" w:before="160"/>
+      </w:pPr>
+      <w:r>
+        <w:rPr>
+          <w:rFonts w:ascii="Times New Roman" w:cs="Times New Roman" w:eastAsia="Times New Roman" w:hAnsi="Times New Roman"/>
+          <w:i/>
+          <w:iCs/>
+          <w:sz w:val="20"/>
+          <w:szCs w:val="20"/>
+        </w:rPr>
+        <w:t xml:space="preserve">B.  Multilingual vocabulary</w:t>
+      </w:r>
+    </w:p>
+    <w:p>
+      <w:pPr>
+        <w:spacing w:after="80"/>
+        <w:jc w:val="both"/>
+      </w:pPr>
+      <w:r>
+        <w:rPr>
+          <w:rFonts w:ascii="Times New Roman" w:cs="Times New Roman" w:eastAsia="Times New Roman" w:hAnsi="Times New Roman"/>
+          <w:sz w:val="20"/>
+          <w:szCs w:val="20"/>
+        </w:rPr>
+        <w:t xml:space="preserve">The lexical component matches a 33-term vocabulary of transliterated phishing lures across four languages. Terms were selected for semantic roles that recur in phishing lures: account, verification, security, urgency and financial instruments. Each matched term contributes a weight of 10. The vocabulary is deduplicated, so a term shared between languages, such as khata and suraksha in Hindi and Telugu, contributes once rather than twice.</w:t>
+      </w:r>
+    </w:p>
+    <w:p>
+      <w:pPr>
+        <w:spacing w:after="0" w:before="140"/>
+        <w:jc w:val="center"/>
+      </w:pPr>
+      <w:r>
+        <w:rPr>
+          <w:rFonts w:ascii="Times New Roman" w:cs="Times New Roman" w:eastAsia="Times New Roman" w:hAnsi="Times New Roman"/>
+          <w:sz w:val="16"/>
+          <w:szCs w:val="16"/>
+        </w:rPr>
+        <w:t xml:space="preserve">TABLE I</w:t>
+      </w:r>
+    </w:p>
+    <w:p>
+      <w:pPr>
+        <w:spacing w:after="60" w:before="0"/>
+        <w:jc w:val="center"/>
+      </w:pPr>
+      <w:r>
+        <w:rPr>
+          <w:rFonts w:ascii="Times New Roman" w:cs="Times New Roman" w:eastAsia="Times New Roman" w:hAnsi="Times New Roman"/>
+          <w:smallCaps/>
+          <w:sz w:val="16"/>
+          <w:szCs w:val="16"/>
+        </w:rPr>
+        <w:t xml:space="preserve">Multilingual Phishing Vocabulary</w:t>
+      </w:r>
+    </w:p>
+    <w:tbl>
+      <w:tblPr>
+        <w:tblW w:type="dxa" w:w="5230"/>
+        <w:tblBorders>
+          <w:top w:val="single" w:color="000000" w:sz="4"/>
+          <w:left w:val="none"/>
+          <w:bottom w:val="single" w:color="000000" w:sz="4"/>
+          <w:right w:val="none"/>
+          <w:insideH w:val="single" w:color="999999" w:sz="2"/>
+          <w:insideV w:val="none"/>
+        </w:tblBorders>
+      </w:tblPr>
+      <w:tblGrid>
+        <w:gridCol w:w="960"/>
+        <w:gridCol w:w="400"/>
+        <w:gridCol w:w="3870"/>
+      </w:tblGrid>
+      <w:tr>
+        <w:trPr>
+          <w:tblHeader/>
+        </w:trPr>
+        <w:tc>
+          <w:tcPr>
+            <w:tcW w:type="dxa" w:w="960"/>
+            <w:shd w:fill="E8E8E8" w:color="auto" w:val="clear"/>
+            <w:tcMar>
+              <w:top w:type="dxa" w:w="40"/>
+              <w:left w:type="dxa" w:w="80"/>
+              <w:bottom w:type="dxa" w:w="40"/>
+              <w:right w:type="dxa" w:w="80"/>
+            </w:tcMar>
+          </w:tcPr>
+          <w:p>
+            <w:pPr>
+              <w:jc w:val="left"/>
+            </w:pPr>
+            <w:r>
+              <w:rPr>
+                <w:rFonts w:ascii="Times New Roman" w:cs="Times New Roman" w:eastAsia="Times New Roman" w:hAnsi="Times New Roman"/>
+                <w:b/>
+                <w:bCs/>
+                <w:i w:val="false"/>
+                <w:iCs w:val="false"/>
+                <w:sz w:val="16"/>
+                <w:szCs w:val="16"/>
+              </w:rPr>
+              <w:t xml:space="preserve">Language</w:t>
+            </w:r>
+          </w:p>
+        </w:tc>
+        <w:tc>
+          <w:tcPr>
+            <w:tcW w:type="dxa" w:w="400"/>
+            <w:shd w:fill="E8E8E8" w:color="auto" w:val="clear"/>
+            <w:tcMar>
+              <w:top w:type="dxa" w:w="40"/>
+              <w:left w:type="dxa" w:w="80"/>
+              <w:bottom w:type="dxa" w:w="40"/>
+              <w:right w:type="dxa" w:w="80"/>
+            </w:tcMar>
+          </w:tcPr>
+          <w:p>
+            <w:pPr>
+              <w:jc w:val="center"/>
+            </w:pPr>
+            <w:r>
+              <w:rPr>
+                <w:rFonts w:ascii="Times New Roman" w:cs="Times New Roman" w:eastAsia="Times New Roman" w:hAnsi="Times New Roman"/>
+                <w:b/>
+                <w:bCs/>
+                <w:i w:val="false"/>
+                <w:iCs w:val="false"/>
+                <w:sz w:val="16"/>
+                <w:szCs w:val="16"/>
+              </w:rPr>
+              <w:t xml:space="preserve">n</w:t>
+            </w:r>
+          </w:p>
+        </w:tc>
+        <w:tc>
+          <w:tcPr>
+            <w:tcW w:type="dxa" w:w="3870"/>
+            <w:shd w:fill="E8E8E8" w:color="auto" w:val="clear"/>
+            <w:tcMar>
+              <w:top w:type="dxa" w:w="40"/>
+              <w:left w:type="dxa" w:w="80"/>
+              <w:bottom w:type="dxa" w:w="40"/>
+              <w:right w:type="dxa" w:w="80"/>
+            </w:tcMar>
+          </w:tcPr>
+          <w:p>
+            <w:pPr>
+              <w:jc w:val="left"/>
+            </w:pPr>
+            <w:r>
+              <w:rPr>
+                <w:rFonts w:ascii="Times New Roman" w:cs="Times New Roman" w:eastAsia="Times New Roman" w:hAnsi="Times New Roman"/>
+                <w:b/>
+                <w:bCs/>
+                <w:i w:val="false"/>
+                <w:iCs w:val="false"/>
+                <w:sz w:val="16"/>
+                <w:szCs w:val="16"/>
+              </w:rPr>
+              <w:t xml:space="preserve">Terms</w:t>
+            </w:r>
+          </w:p>
+        </w:tc>
+      </w:tr>
+      <w:tr>
+        <w:trPr>
+          <w:tblHeader w:val="false"/>
+        </w:trPr>
+        <w:tc>
+          <w:tcPr>
+            <w:tcW w:type="dxa" w:w="960"/>
+            <w:tcMar>
+              <w:top w:type="dxa" w:w="40"/>
+              <w:left w:type="dxa" w:w="80"/>
+              <w:bottom w:type="dxa" w:w="40"/>
+              <w:right w:type="dxa" w:w="80"/>
+            </w:tcMar>
+          </w:tcPr>
+          <w:p>
+            <w:pPr>
+              <w:jc w:val="left"/>
+            </w:pPr>
+            <w:r>
+              <w:rPr>
+                <w:rFonts w:ascii="Times New Roman" w:cs="Times New Roman" w:eastAsia="Times New Roman" w:hAnsi="Times New Roman"/>
+                <w:b w:val="false"/>
+                <w:bCs w:val="false"/>
+                <w:i w:val="false"/>
+                <w:iCs w:val="false"/>
+                <w:sz w:val="16"/>
+                <w:szCs w:val="16"/>
+              </w:rPr>
+              <w:t xml:space="preserve">English</w:t>
+            </w:r>
+          </w:p>
+        </w:tc>
+        <w:tc>
+          <w:tcPr>
+            <w:tcW w:type="dxa" w:w="400"/>
+            <w:tcMar>
+              <w:top w:type="dxa" w:w="40"/>
+              <w:left w:type="dxa" w:w="80"/>
+              <w:bottom w:type="dxa" w:w="40"/>
+              <w:right w:type="dxa" w:w="80"/>
+            </w:tcMar>
+          </w:tcPr>
+          <w:p>
+            <w:pPr>
+              <w:jc w:val="center"/>
+            </w:pPr>
+            <w:r>
+              <w:rPr>
+                <w:rFonts w:ascii="Times New Roman" w:cs="Times New Roman" w:eastAsia="Times New Roman" w:hAnsi="Times New Roman"/>
+                <w:b w:val="false"/>
+                <w:bCs w:val="false"/>
+                <w:i w:val="false"/>
+                <w:iCs w:val="false"/>
+                <w:sz w:val="16"/>
+                <w:szCs w:val="16"/>
+              </w:rPr>
+              <w:t xml:space="preserve">9</w:t>
+            </w:r>
+          </w:p>
+        </w:tc>
+        <w:tc>
+          <w:tcPr>
+            <w:tcW w:type="dxa" w:w="3870"/>
+            <w:tcMar>
+              <w:top w:type="dxa" w:w="40"/>
+              <w:left w:type="dxa" w:w="80"/>
+              <w:bottom w:type="dxa" w:w="40"/>
+              <w:right w:type="dxa" w:w="80"/>
+            </w:tcMar>
+          </w:tcPr>
+          <w:p>
+            <w:pPr>
+              <w:jc w:val="left"/>
+            </w:pPr>
+            <w:r>
+              <w:rPr>
+                <w:rFonts w:ascii="Times New Roman" w:cs="Times New Roman" w:eastAsia="Times New Roman" w:hAnsi="Times New Roman"/>
+                <w:b w:val="false"/>
+                <w:bCs w:val="false"/>
+                <w:i w:val="false"/>
+                <w:iCs w:val="false"/>
+                <w:sz w:val="16"/>
+                <w:szCs w:val="16"/>
+              </w:rPr>
+              <w:t xml:space="preserve">login, verify, secure, account, update, bank, otp, signin, password</w:t>
+            </w:r>
+          </w:p>
+        </w:tc>
+      </w:tr>
+      <w:tr>
+        <w:trPr>
+          <w:tblHeader w:val="false"/>
+        </w:trPr>
+        <w:tc>
+          <w:tcPr>
+            <w:tcW w:type="dxa" w:w="960"/>
+            <w:tcMar>
+              <w:top w:type="dxa" w:w="40"/>
+              <w:left w:type="dxa" w:w="80"/>
+              <w:bottom w:type="dxa" w:w="40"/>
+              <w:right w:type="dxa" w:w="80"/>
+            </w:tcMar>
+          </w:tcPr>
+          <w:p>
+            <w:pPr>
+              <w:jc w:val="left"/>
+            </w:pPr>
+            <w:r>
+              <w:rPr>
+                <w:rFonts w:ascii="Times New Roman" w:cs="Times New Roman" w:eastAsia="Times New Roman" w:hAnsi="Times New Roman"/>
+                <w:b w:val="false"/>
+                <w:bCs w:val="false"/>
+                <w:i w:val="false"/>
+                <w:iCs w:val="false"/>
+                <w:sz w:val="16"/>
+                <w:szCs w:val="16"/>
+              </w:rPr>
+              <w:t xml:space="preserve">Hindi</w:t>
+            </w:r>
+          </w:p>
+        </w:tc>
+        <w:tc>
+          <w:tcPr>
+            <w:tcW w:type="dxa" w:w="400"/>
+            <w:tcMar>
+              <w:top w:type="dxa" w:w="40"/>
+              <w:left w:type="dxa" w:w="80"/>
+              <w:bottom w:type="dxa" w:w="40"/>
+              <w:right w:type="dxa" w:w="80"/>
+            </w:tcMar>
+          </w:tcPr>
+          <w:p>
+            <w:pPr>
+              <w:jc w:val="center"/>
+            </w:pPr>
+            <w:r>
+              <w:rPr>
+                <w:rFonts w:ascii="Times New Roman" w:cs="Times New Roman" w:eastAsia="Times New Roman" w:hAnsi="Times New Roman"/>
+                <w:b w:val="false"/>
+                <w:bCs w:val="false"/>
+                <w:i w:val="false"/>
+                <w:iCs w:val="false"/>
+                <w:sz w:val="16"/>
+                <w:szCs w:val="16"/>
+              </w:rPr>
+              <w:t xml:space="preserve">11</w:t>
+            </w:r>
+          </w:p>
+        </w:tc>
+        <w:tc>
+          <w:tcPr>
+            <w:tcW w:type="dxa" w:w="3870"/>
+            <w:tcMar>
+              <w:top w:type="dxa" w:w="40"/>
+              <w:left w:type="dxa" w:w="80"/>
+              <w:bottom w:type="dxa" w:w="40"/>
+              <w:right w:type="dxa" w:w="80"/>
+            </w:tcMar>
+          </w:tcPr>
+          <w:p>
+            <w:pPr>
+              <w:jc w:val="left"/>
+            </w:pPr>
+            <w:r>
+              <w:rPr>
+                <w:rFonts w:ascii="Times New Roman" w:cs="Times New Roman" w:eastAsia="Times New Roman" w:hAnsi="Times New Roman"/>
+                <w:b w:val="false"/>
+                <w:bCs w:val="false"/>
+                <w:i w:val="false"/>
+                <w:iCs w:val="false"/>
+                <w:sz w:val="16"/>
+                <w:szCs w:val="16"/>
+              </w:rPr>
+              <w:t xml:space="preserve">kyc, aadhaar, pan, banking, verifyotp, suraksha, khata, jaanch, satyapan, turant, seva</w:t>
+            </w:r>
+          </w:p>
+        </w:tc>
+      </w:tr>
+      <w:tr>
+        <w:trPr>
+          <w:tblHeader w:val="false"/>
+        </w:trPr>
+        <w:tc>
+          <w:tcPr>
+            <w:tcW w:type="dxa" w:w="960"/>
+            <w:tcMar>
+              <w:top w:type="dxa" w:w="40"/>
+              <w:left w:type="dxa" w:w="80"/>
+              <w:bottom w:type="dxa" w:w="40"/>
+              <w:right w:type="dxa" w:w="80"/>
+            </w:tcMar>
+          </w:tcPr>
+          <w:p>
+            <w:pPr>
+              <w:jc w:val="left"/>
+            </w:pPr>
+            <w:r>
+              <w:rPr>
+                <w:rFonts w:ascii="Times New Roman" w:cs="Times New Roman" w:eastAsia="Times New Roman" w:hAnsi="Times New Roman"/>
+                <w:b w:val="false"/>
+                <w:bCs w:val="false"/>
+                <w:i w:val="false"/>
+                <w:iCs w:val="false"/>
+                <w:sz w:val="16"/>
+                <w:szCs w:val="16"/>
+              </w:rPr>
+              <w:t xml:space="preserve">Tamil</w:t>
+            </w:r>
+          </w:p>
+        </w:tc>
+        <w:tc>
+          <w:tcPr>
+            <w:tcW w:type="dxa" w:w="400"/>
+            <w:tcMar>
+              <w:top w:type="dxa" w:w="40"/>
+              <w:left w:type="dxa" w:w="80"/>
+              <w:bottom w:type="dxa" w:w="40"/>
+              <w:right w:type="dxa" w:w="80"/>
+            </w:tcMar>
+          </w:tcPr>
+          <w:p>
+            <w:pPr>
+              <w:jc w:val="center"/>
+            </w:pPr>
+            <w:r>
+              <w:rPr>
+                <w:rFonts w:ascii="Times New Roman" w:cs="Times New Roman" w:eastAsia="Times New Roman" w:hAnsi="Times New Roman"/>
+                <w:b w:val="false"/>
+                <w:bCs w:val="false"/>
+                <w:i w:val="false"/>
+                <w:iCs w:val="false"/>
+                <w:sz w:val="16"/>
+                <w:szCs w:val="16"/>
+              </w:rPr>
+              <w:t xml:space="preserve">9</w:t>
+            </w:r>
+          </w:p>
+        </w:tc>
+        <w:tc>
+          <w:tcPr>
+            <w:tcW w:type="dxa" w:w="3870"/>
+            <w:tcMar>
+              <w:top w:type="dxa" w:w="40"/>
+              <w:left w:type="dxa" w:w="80"/>
+              <w:bottom w:type="dxa" w:w="40"/>
+              <w:right w:type="dxa" w:w="80"/>
+            </w:tcMar>
+          </w:tcPr>
+          <w:p>
+            <w:pPr>
+              <w:jc w:val="left"/>
+            </w:pPr>
+            <w:r>
+              <w:rPr>
+                <w:rFonts w:ascii="Times New Roman" w:cs="Times New Roman" w:eastAsia="Times New Roman" w:hAnsi="Times New Roman"/>
+                <w:b w:val="false"/>
+                <w:bCs w:val="false"/>
+                <w:i w:val="false"/>
+                <w:iCs w:val="false"/>
+                <w:sz w:val="16"/>
+                <w:szCs w:val="16"/>
+              </w:rPr>
+              <w:t xml:space="preserve">vangi, kanakku, urudhi, puduppi, paathukaappu, seyal, udanadi, otpverify, bankupdate</w:t>
+            </w:r>
+          </w:p>
+        </w:tc>
+      </w:tr>
+      <w:tr>
+        <w:trPr>
+          <w:tblHeader w:val="false"/>
+        </w:trPr>
+        <w:tc>
+          <w:tcPr>
+            <w:tcW w:type="dxa" w:w="960"/>
+            <w:tcMar>
+              <w:top w:type="dxa" w:w="40"/>
+              <w:left w:type="dxa" w:w="80"/>
+              <w:bottom w:type="dxa" w:w="40"/>
+              <w:right w:type="dxa" w:w="80"/>
+            </w:tcMar>
+          </w:tcPr>
+          <w:p>
+            <w:pPr>
+              <w:jc w:val="left"/>
+            </w:pPr>
+            <w:r>
+              <w:rPr>
+                <w:rFonts w:ascii="Times New Roman" w:cs="Times New Roman" w:eastAsia="Times New Roman" w:hAnsi="Times New Roman"/>
+                <w:b w:val="false"/>
+                <w:bCs w:val="false"/>
+                <w:i w:val="false"/>
+                <w:iCs w:val="false"/>
+                <w:sz w:val="16"/>
+                <w:szCs w:val="16"/>
+              </w:rPr>
+              <w:t xml:space="preserve">Telugu</w:t>
+            </w:r>
+          </w:p>
+        </w:tc>
+        <w:tc>
+          <w:tcPr>
+            <w:tcW w:type="dxa" w:w="400"/>
+            <w:tcMar>
+              <w:top w:type="dxa" w:w="40"/>
+              <w:left w:type="dxa" w:w="80"/>
+              <w:bottom w:type="dxa" w:w="40"/>
+              <w:right w:type="dxa" w:w="80"/>
+            </w:tcMar>
+          </w:tcPr>
+          <w:p>
+            <w:pPr>
+              <w:jc w:val="center"/>
+            </w:pPr>
+            <w:r>
+              <w:rPr>
+                <w:rFonts w:ascii="Times New Roman" w:cs="Times New Roman" w:eastAsia="Times New Roman" w:hAnsi="Times New Roman"/>
+                <w:b w:val="false"/>
+                <w:bCs w:val="false"/>
+                <w:i w:val="false"/>
+                <w:iCs w:val="false"/>
+                <w:sz w:val="16"/>
+                <w:szCs w:val="16"/>
+              </w:rPr>
+              <w:t xml:space="preserve">4</w:t>
+            </w:r>
+          </w:p>
+        </w:tc>
+        <w:tc>
+          <w:tcPr>
+            <w:tcW w:type="dxa" w:w="3870"/>
+            <w:tcMar>
+              <w:top w:type="dxa" w:w="40"/>
+              <w:left w:type="dxa" w:w="80"/>
+              <w:bottom w:type="dxa" w:w="40"/>
+              <w:right w:type="dxa" w:w="80"/>
+            </w:tcMar>
+          </w:tcPr>
+          <w:p>
+            <w:pPr>
+              <w:jc w:val="left"/>
+            </w:pPr>
+            <w:r>
+              <w:rPr>
+                <w:rFonts w:ascii="Times New Roman" w:cs="Times New Roman" w:eastAsia="Times New Roman" w:hAnsi="Times New Roman"/>
+                <w:b w:val="false"/>
+                <w:bCs w:val="false"/>
+                <w:i w:val="false"/>
+                <w:iCs w:val="false"/>
+                <w:sz w:val="16"/>
+                <w:szCs w:val="16"/>
+              </w:rPr>
+              <w:t xml:space="preserve">dhruvikarinchu, vaddi, runam, podupukhata</w:t>
+            </w:r>
+          </w:p>
+        </w:tc>
+      </w:tr>
+    </w:tbl>
+    <w:p>
+      <w:pPr>
+        <w:spacing w:after="80" w:before="160"/>
+      </w:pPr>
+      <w:r>
+        <w:rPr>
+          <w:rFonts w:ascii="Times New Roman" w:cs="Times New Roman" w:eastAsia="Times New Roman" w:hAnsi="Times New Roman"/>
+          <w:i/>
+          <w:iCs/>
+          <w:sz w:val="20"/>
+          <w:szCs w:val="20"/>
+        </w:rPr>
+        <w:t xml:space="preserve">C.  Structural rules</w:t>
+      </w:r>
+    </w:p>
+    <w:p>
+      <w:pPr>
+        <w:spacing w:after="80"/>
+        <w:jc w:val="both"/>
+      </w:pPr>
+      <w:r>
+        <w:rPr>
+          <w:rFonts w:ascii="Times New Roman" w:cs="Times New Roman" w:eastAsia="Times New Roman" w:hAnsi="Times New Roman"/>
+          <w:sz w:val="20"/>
+          <w:szCs w:val="20"/>
+        </w:rPr>
+        <w:t xml:space="preserve">Four structural indicators complement the vocabulary. Their weights and thresholds are given in Table II. The at-sign carries double weight because, in a URL, everything preceding it in the authority component is discarded by the browser, making it a direct mechanism for disguising the true host rather than a statistical correlate of one.</w:t>
+      </w:r>
+    </w:p>
+    <w:p>
+      <w:pPr>
+        <w:spacing w:after="0" w:before="140"/>
+        <w:jc w:val="center"/>
+      </w:pPr>
+      <w:r>
+        <w:rPr>
+          <w:rFonts w:ascii="Times New Roman" w:cs="Times New Roman" w:eastAsia="Times New Roman" w:hAnsi="Times New Roman"/>
+          <w:sz w:val="16"/>
+          <w:szCs w:val="16"/>
+        </w:rPr>
+        <w:t xml:space="preserve">TABLE II</w:t>
+      </w:r>
+    </w:p>
+    <w:p>
+      <w:pPr>
+        <w:spacing w:after="60" w:before="0"/>
+        <w:jc w:val="center"/>
+      </w:pPr>
+      <w:r>
+        <w:rPr>
+          <w:rFonts w:ascii="Times New Roman" w:cs="Times New Roman" w:eastAsia="Times New Roman" w:hAnsi="Times New Roman"/>
+          <w:smallCaps/>
+          <w:sz w:val="16"/>
+          <w:szCs w:val="16"/>
+        </w:rPr>
+        <w:t xml:space="preserve">Rule Weights and Thresholds</w:t>
+      </w:r>
+    </w:p>
+    <w:tbl>
+      <w:tblPr>
+        <w:tblW w:type="dxa" w:w="5230"/>
+        <w:tblBorders>
+          <w:top w:val="single" w:color="000000" w:sz="4"/>
+          <w:left w:val="none"/>
+          <w:bottom w:val="single" w:color="000000" w:sz="4"/>
+          <w:right w:val="none"/>
+          <w:insideH w:val="single" w:color="999999" w:sz="2"/>
+          <w:insideV w:val="none"/>
+        </w:tblBorders>
+      </w:tblPr>
+      <w:tblGrid>
+        <w:gridCol w:w="1450"/>
+        <w:gridCol w:w="2490"/>
+        <w:gridCol w:w="1290"/>
+      </w:tblGrid>
+      <w:tr>
+        <w:trPr>
+          <w:tblHeader/>
+        </w:trPr>
+        <w:tc>
+          <w:tcPr>
+            <w:tcW w:type="dxa" w:w="1450"/>
+            <w:shd w:fill="E8E8E8" w:color="auto" w:val="clear"/>
+            <w:tcMar>
+              <w:top w:type="dxa" w:w="40"/>
+              <w:left w:type="dxa" w:w="80"/>
+              <w:bottom w:type="dxa" w:w="40"/>
+              <w:right w:type="dxa" w:w="80"/>
+            </w:tcMar>
+          </w:tcPr>
+          <w:p>
+            <w:pPr>
+              <w:jc w:val="left"/>
+            </w:pPr>
+            <w:r>
+              <w:rPr>
+                <w:rFonts w:ascii="Times New Roman" w:cs="Times New Roman" w:eastAsia="Times New Roman" w:hAnsi="Times New Roman"/>
+                <w:b/>
+                <w:bCs/>
+                <w:i w:val="false"/>
+                <w:iCs w:val="false"/>
+                <w:sz w:val="16"/>
+                <w:szCs w:val="16"/>
+              </w:rPr>
+              <w:t xml:space="preserve">Rule</w:t>
+            </w:r>
+          </w:p>
+        </w:tc>
+        <w:tc>
+          <w:tcPr>
+            <w:tcW w:type="dxa" w:w="2490"/>
+            <w:shd w:fill="E8E8E8" w:color="auto" w:val="clear"/>
+            <w:tcMar>
+              <w:top w:type="dxa" w:w="40"/>
+              <w:left w:type="dxa" w:w="80"/>
+              <w:bottom w:type="dxa" w:w="40"/>
+              <w:right w:type="dxa" w:w="80"/>
+            </w:tcMar>
+          </w:tcPr>
+          <w:p>
+            <w:pPr>
+              <w:jc w:val="left"/>
+            </w:pPr>
+            <w:r>
+              <w:rPr>
+                <w:rFonts w:ascii="Times New Roman" w:cs="Times New Roman" w:eastAsia="Times New Roman" w:hAnsi="Times New Roman"/>
+                <w:b/>
+                <w:bCs/>
+                <w:i w:val="false"/>
+                <w:iCs w:val="false"/>
+                <w:sz w:val="16"/>
+                <w:szCs w:val="16"/>
+              </w:rPr>
+              <w:t xml:space="preserve">Condition</w:t>
+            </w:r>
+          </w:p>
+        </w:tc>
+        <w:tc>
+          <w:tcPr>
+            <w:tcW w:type="dxa" w:w="1290"/>
+            <w:shd w:fill="E8E8E8" w:color="auto" w:val="clear"/>
+            <w:tcMar>
+              <w:top w:type="dxa" w:w="40"/>
+              <w:left w:type="dxa" w:w="80"/>
+              <w:bottom w:type="dxa" w:w="40"/>
+              <w:right w:type="dxa" w:w="80"/>
+            </w:tcMar>
+          </w:tcPr>
+          <w:p>
+            <w:pPr>
+              <w:jc w:val="center"/>
+            </w:pPr>
+            <w:r>
+              <w:rPr>
+                <w:rFonts w:ascii="Times New Roman" w:cs="Times New Roman" w:eastAsia="Times New Roman" w:hAnsi="Times New Roman"/>
+                <w:b/>
+                <w:bCs/>
+                <w:i w:val="false"/>
+                <w:iCs w:val="false"/>
+                <w:sz w:val="16"/>
+                <w:szCs w:val="16"/>
+              </w:rPr>
+              <w:t xml:space="preserve">Weight</w:t>
+            </w:r>
+          </w:p>
+        </w:tc>
+      </w:tr>
+      <w:tr>
+        <w:trPr>
+          <w:tblHeader w:val="false"/>
+        </w:trPr>
+        <w:tc>
+          <w:tcPr>
+            <w:tcW w:type="dxa" w:w="1450"/>
+            <w:tcMar>
+              <w:top w:type="dxa" w:w="40"/>
+              <w:left w:type="dxa" w:w="80"/>
+              <w:bottom w:type="dxa" w:w="40"/>
+              <w:right w:type="dxa" w:w="80"/>
+            </w:tcMar>
+          </w:tcPr>
+          <w:p>
+            <w:pPr>
+              <w:jc w:val="left"/>
+            </w:pPr>
+            <w:r>
+              <w:rPr>
+                <w:rFonts w:ascii="Times New Roman" w:cs="Times New Roman" w:eastAsia="Times New Roman" w:hAnsi="Times New Roman"/>
+                <w:b w:val="false"/>
+                <w:bCs w:val="false"/>
+                <w:i w:val="false"/>
+                <w:iCs w:val="false"/>
+                <w:sz w:val="16"/>
+                <w:szCs w:val="16"/>
+              </w:rPr>
+              <w:t xml:space="preserve">keyword</w:t>
+            </w:r>
+          </w:p>
+        </w:tc>
+        <w:tc>
+          <w:tcPr>
+            <w:tcW w:type="dxa" w:w="2490"/>
+            <w:tcMar>
+              <w:top w:type="dxa" w:w="40"/>
+              <w:left w:type="dxa" w:w="80"/>
+              <w:bottom w:type="dxa" w:w="40"/>
+              <w:right w:type="dxa" w:w="80"/>
+            </w:tcMar>
+          </w:tcPr>
+          <w:p>
+            <w:pPr>
+              <w:jc w:val="left"/>
+            </w:pPr>
+            <w:r>
+              <w:rPr>
+                <w:rFonts w:ascii="Times New Roman" w:cs="Times New Roman" w:eastAsia="Times New Roman" w:hAnsi="Times New Roman"/>
+                <w:b w:val="false"/>
+                <w:bCs w:val="false"/>
+                <w:i w:val="false"/>
+                <w:iCs w:val="false"/>
+                <w:sz w:val="16"/>
+                <w:szCs w:val="16"/>
+              </w:rPr>
+              <w:t xml:space="preserve">vocabulary term present</w:t>
+            </w:r>
+          </w:p>
+        </w:tc>
+        <w:tc>
+          <w:tcPr>
+            <w:tcW w:type="dxa" w:w="1290"/>
+            <w:tcMar>
+              <w:top w:type="dxa" w:w="40"/>
+              <w:left w:type="dxa" w:w="80"/>
+              <w:bottom w:type="dxa" w:w="40"/>
+              <w:right w:type="dxa" w:w="80"/>
+            </w:tcMar>
+          </w:tcPr>
+          <w:p>
+            <w:pPr>
+              <w:jc w:val="center"/>
+            </w:pPr>
+            <w:r>
+              <w:rPr>
+                <w:rFonts w:ascii="Times New Roman" w:cs="Times New Roman" w:eastAsia="Times New Roman" w:hAnsi="Times New Roman"/>
+                <w:b w:val="false"/>
+                <w:bCs w:val="false"/>
+                <w:i w:val="false"/>
+                <w:iCs w:val="false"/>
+                <w:sz w:val="16"/>
+                <w:szCs w:val="16"/>
+              </w:rPr>
+              <w:t xml:space="preserve">10 each</w:t>
+            </w:r>
+          </w:p>
+        </w:tc>
+      </w:tr>
+      <w:tr>
+        <w:trPr>
+          <w:tblHeader w:val="false"/>
+        </w:trPr>
+        <w:tc>
+          <w:tcPr>
+            <w:tcW w:type="dxa" w:w="1450"/>
+            <w:tcMar>
+              <w:top w:type="dxa" w:w="40"/>
+              <w:left w:type="dxa" w:w="80"/>
+              <w:bottom w:type="dxa" w:w="40"/>
+              <w:right w:type="dxa" w:w="80"/>
+            </w:tcMar>
+          </w:tcPr>
+          <w:p>
+            <w:pPr>
+              <w:jc w:val="left"/>
+            </w:pPr>
+            <w:r>
+              <w:rPr>
+                <w:rFonts w:ascii="Times New Roman" w:cs="Times New Roman" w:eastAsia="Times New Roman" w:hAnsi="Times New Roman"/>
+                <w:b w:val="false"/>
+                <w:bCs w:val="false"/>
+                <w:i w:val="false"/>
+                <w:iCs w:val="false"/>
+                <w:sz w:val="16"/>
+                <w:szCs w:val="16"/>
+              </w:rPr>
+              <w:t xml:space="preserve">long_url</w:t>
+            </w:r>
+          </w:p>
+        </w:tc>
+        <w:tc>
+          <w:tcPr>
+            <w:tcW w:type="dxa" w:w="2490"/>
+            <w:tcMar>
+              <w:top w:type="dxa" w:w="40"/>
+              <w:left w:type="dxa" w:w="80"/>
+              <w:bottom w:type="dxa" w:w="40"/>
+              <w:right w:type="dxa" w:w="80"/>
+            </w:tcMar>
+          </w:tcPr>
+          <w:p>
+            <w:pPr>
+              <w:jc w:val="left"/>
+            </w:pPr>
+            <w:r>
+              <w:rPr>
+                <w:rFonts w:ascii="Times New Roman" w:cs="Times New Roman" w:eastAsia="Times New Roman" w:hAnsi="Times New Roman"/>
+                <w:b w:val="false"/>
+                <w:bCs w:val="false"/>
+                <w:i w:val="false"/>
+                <w:iCs w:val="false"/>
+                <w:sz w:val="16"/>
+                <w:szCs w:val="16"/>
+              </w:rPr>
+              <w:t xml:space="preserve">length &gt; 30 characters</w:t>
+            </w:r>
+          </w:p>
+        </w:tc>
+        <w:tc>
+          <w:tcPr>
+            <w:tcW w:type="dxa" w:w="1290"/>
+            <w:tcMar>
+              <w:top w:type="dxa" w:w="40"/>
+              <w:left w:type="dxa" w:w="80"/>
+              <w:bottom w:type="dxa" w:w="40"/>
+              <w:right w:type="dxa" w:w="80"/>
+            </w:tcMar>
+          </w:tcPr>
+          <w:p>
+            <w:pPr>
+              <w:jc w:val="center"/>
+            </w:pPr>
+            <w:r>
+              <w:rPr>
+                <w:rFonts w:ascii="Times New Roman" w:cs="Times New Roman" w:eastAsia="Times New Roman" w:hAnsi="Times New Roman"/>
+                <w:b w:val="false"/>
+                <w:bCs w:val="false"/>
+                <w:i w:val="false"/>
+                <w:iCs w:val="false"/>
+                <w:sz w:val="16"/>
+                <w:szCs w:val="16"/>
+              </w:rPr>
+              <w:t xml:space="preserve">10</w:t>
+            </w:r>
+          </w:p>
+        </w:tc>
+      </w:tr>
+      <w:tr>
+        <w:trPr>
+          <w:tblHeader w:val="false"/>
+        </w:trPr>
+        <w:tc>
+          <w:tcPr>
+            <w:tcW w:type="dxa" w:w="1450"/>
+            <w:tcMar>
+              <w:top w:type="dxa" w:w="40"/>
+              <w:left w:type="dxa" w:w="80"/>
+              <w:bottom w:type="dxa" w:w="40"/>
+              <w:right w:type="dxa" w:w="80"/>
+            </w:tcMar>
+          </w:tcPr>
+          <w:p>
+            <w:pPr>
+              <w:jc w:val="left"/>
+            </w:pPr>
+            <w:r>
+              <w:rPr>
+                <w:rFonts w:ascii="Times New Roman" w:cs="Times New Roman" w:eastAsia="Times New Roman" w:hAnsi="Times New Roman"/>
+                <w:b w:val="false"/>
+                <w:bCs w:val="false"/>
+                <w:i w:val="false"/>
+                <w:iCs w:val="false"/>
+                <w:sz w:val="16"/>
+                <w:szCs w:val="16"/>
+              </w:rPr>
+              <w:t xml:space="preserve">at_symbol</w:t>
+            </w:r>
+          </w:p>
+        </w:tc>
+        <w:tc>
+          <w:tcPr>
+            <w:tcW w:type="dxa" w:w="2490"/>
+            <w:tcMar>
+              <w:top w:type="dxa" w:w="40"/>
+              <w:left w:type="dxa" w:w="80"/>
+              <w:bottom w:type="dxa" w:w="40"/>
+              <w:right w:type="dxa" w:w="80"/>
+            </w:tcMar>
+          </w:tcPr>
+          <w:p>
+            <w:pPr>
+              <w:jc w:val="left"/>
+            </w:pPr>
+            <w:r>
+              <w:rPr>
+                <w:rFonts w:ascii="Times New Roman" w:cs="Times New Roman" w:eastAsia="Times New Roman" w:hAnsi="Times New Roman"/>
+                <w:b w:val="false"/>
+                <w:bCs w:val="false"/>
+                <w:i w:val="false"/>
+                <w:iCs w:val="false"/>
+                <w:sz w:val="16"/>
+                <w:szCs w:val="16"/>
+              </w:rPr>
+              <w:t xml:space="preserve">'@' present</w:t>
+            </w:r>
+          </w:p>
+        </w:tc>
+        <w:tc>
+          <w:tcPr>
+            <w:tcW w:type="dxa" w:w="1290"/>
+            <w:tcMar>
+              <w:top w:type="dxa" w:w="40"/>
+              <w:left w:type="dxa" w:w="80"/>
+              <w:bottom w:type="dxa" w:w="40"/>
+              <w:right w:type="dxa" w:w="80"/>
+            </w:tcMar>
+          </w:tcPr>
+          <w:p>
+            <w:pPr>
+              <w:jc w:val="center"/>
+            </w:pPr>
+            <w:r>
+              <w:rPr>
+                <w:rFonts w:ascii="Times New Roman" w:cs="Times New Roman" w:eastAsia="Times New Roman" w:hAnsi="Times New Roman"/>
+                <w:b w:val="false"/>
+                <w:bCs w:val="false"/>
+                <w:i w:val="false"/>
+                <w:iCs w:val="false"/>
+                <w:sz w:val="16"/>
+                <w:szCs w:val="16"/>
+              </w:rPr>
+              <w:t xml:space="preserve">20</w:t>
+            </w:r>
+          </w:p>
+        </w:tc>
+      </w:tr>
+      <w:tr>
+        <w:trPr>
+          <w:tblHeader w:val="false"/>
+        </w:trPr>
+        <w:tc>
+          <w:tcPr>
+            <w:tcW w:type="dxa" w:w="1450"/>
+            <w:tcMar>
+              <w:top w:type="dxa" w:w="40"/>
+              <w:left w:type="dxa" w:w="80"/>
+              <w:bottom w:type="dxa" w:w="40"/>
+              <w:right w:type="dxa" w:w="80"/>
+            </w:tcMar>
+          </w:tcPr>
+          <w:p>
+            <w:pPr>
+              <w:jc w:val="left"/>
+            </w:pPr>
+            <w:r>
+              <w:rPr>
+                <w:rFonts w:ascii="Times New Roman" w:cs="Times New Roman" w:eastAsia="Times New Roman" w:hAnsi="Times New Roman"/>
+                <w:b w:val="false"/>
+                <w:bCs w:val="false"/>
+                <w:i w:val="false"/>
+                <w:iCs w:val="false"/>
+                <w:sz w:val="16"/>
+                <w:szCs w:val="16"/>
+              </w:rPr>
+              <w:t xml:space="preserve">many_dots</w:t>
+            </w:r>
+          </w:p>
+        </w:tc>
+        <w:tc>
+          <w:tcPr>
+            <w:tcW w:type="dxa" w:w="2490"/>
+            <w:tcMar>
+              <w:top w:type="dxa" w:w="40"/>
+              <w:left w:type="dxa" w:w="80"/>
+              <w:bottom w:type="dxa" w:w="40"/>
+              <w:right w:type="dxa" w:w="80"/>
+            </w:tcMar>
+          </w:tcPr>
+          <w:p>
+            <w:pPr>
+              <w:jc w:val="left"/>
+            </w:pPr>
+            <w:r>
+              <w:rPr>
+                <w:rFonts w:ascii="Times New Roman" w:cs="Times New Roman" w:eastAsia="Times New Roman" w:hAnsi="Times New Roman"/>
+                <w:b w:val="false"/>
+                <w:bCs w:val="false"/>
+                <w:i w:val="false"/>
+                <w:iCs w:val="false"/>
+                <w:sz w:val="16"/>
+                <w:szCs w:val="16"/>
+              </w:rPr>
+              <w:t xml:space="preserve">more than 3 dots</w:t>
+            </w:r>
+          </w:p>
+        </w:tc>
+        <w:tc>
+          <w:tcPr>
+            <w:tcW w:type="dxa" w:w="1290"/>
+            <w:tcMar>
+              <w:top w:type="dxa" w:w="40"/>
+              <w:left w:type="dxa" w:w="80"/>
+              <w:bottom w:type="dxa" w:w="40"/>
+              <w:right w:type="dxa" w:w="80"/>
+            </w:tcMar>
+          </w:tcPr>
+          <w:p>
+            <w:pPr>
+              <w:jc w:val="center"/>
+            </w:pPr>
+            <w:r>
+              <w:rPr>
+                <w:rFonts w:ascii="Times New Roman" w:cs="Times New Roman" w:eastAsia="Times New Roman" w:hAnsi="Times New Roman"/>
+                <w:b w:val="false"/>
+                <w:bCs w:val="false"/>
+                <w:i w:val="false"/>
+                <w:iCs w:val="false"/>
+                <w:sz w:val="16"/>
+                <w:szCs w:val="16"/>
+              </w:rPr>
+              <w:t xml:space="preserve">10</w:t>
+            </w:r>
+          </w:p>
+        </w:tc>
+      </w:tr>
+    </w:tbl>
+    <w:p>
+      <w:pPr>
+        <w:spacing w:after="120" w:before="60"/>
+        <w:jc w:val="left"/>
+      </w:pPr>
+      <w:r>
+        <w:rPr>
+          <w:rFonts w:ascii="Times New Roman" w:cs="Times New Roman" w:eastAsia="Times New Roman" w:hAnsi="Times New Roman"/>
+          <w:i/>
+          <w:iCs/>
+          <w:sz w:val="16"/>
+          <w:szCs w:val="16"/>
+        </w:rPr>
+        <w:t xml:space="preserve">Weights are inherited unchanged from the prototype system so that the refactored detector remains behaviourally comparable to it.</w:t>
+      </w:r>
+    </w:p>
+    <w:p>
+      <w:pPr>
+        <w:spacing w:after="80" w:before="160"/>
+      </w:pPr>
+      <w:r>
+        <w:rPr>
+          <w:rFonts w:ascii="Times New Roman" w:cs="Times New Roman" w:eastAsia="Times New Roman" w:hAnsi="Times New Roman"/>
+          <w:i/>
+          <w:iCs/>
+          <w:sz w:val="20"/>
+          <w:szCs w:val="20"/>
+        </w:rPr>
+        <w:t xml:space="preserve">D.  Risk bands</w:t>
+      </w:r>
+    </w:p>
+    <w:p>
+      <w:pPr>
+        <w:spacing w:after="80"/>
+        <w:jc w:val="both"/>
+      </w:pPr>
+      <w:r>
+        <w:rPr>
+          <w:rFonts w:ascii="Times New Roman" w:cs="Times New Roman" w:eastAsia="Times New Roman" w:hAnsi="Times New Roman"/>
+          <w:sz w:val="20"/>
+          <w:szCs w:val="20"/>
+        </w:rPr>
+        <w:t xml:space="preserve">The score is mapped to three bands: Low Risk below 30, Medium Risk from 30 to 59, and High Risk at 60 and above. The High Risk boundary is the operating threshold used for binary classification in Section VI. Because the threshold is a free parameter rather than a property of the method, Section VII reports a sweep across its full range rather than defending the default in isolation.</w:t>
+      </w:r>
+    </w:p>
+    <w:p>
+      <w:pPr>
+        <w:spacing w:after="80" w:before="160"/>
+      </w:pPr>
+      <w:r>
+        <w:rPr>
+          <w:rFonts w:ascii="Times New Roman" w:cs="Times New Roman" w:eastAsia="Times New Roman" w:hAnsi="Times New Roman"/>
+          <w:i/>
+          <w:iCs/>
+          <w:sz w:val="20"/>
+          <w:szCs w:val="20"/>
+        </w:rPr>
+        <w:t xml:space="preserve">E.  Explainability</w:t>
+      </w:r>
+    </w:p>
+    <w:p>
+      <w:pPr>
+        <w:spacing w:after="80"/>
+        <w:jc w:val="both"/>
+      </w:pPr>
+      <w:r>
+        <w:rPr>
+          <w:rFonts w:ascii="Times New Roman" w:cs="Times New Roman" w:eastAsia="Times New Roman" w:hAnsi="Times New Roman"/>
+          <w:sz w:val="20"/>
+          <w:szCs w:val="20"/>
+        </w:rPr>
+        <w:t xml:space="preserve">The detector returns, alongside the score and band, the identity and weight of every rule that fired. A verdict is therefore not a bare label but an itemised account: a user sees which terms matched and what each contributed. This property is a consequence of the additive design rather than a post hoc attribution method, and it holds exactly rather than approximately.</w:t>
       </w:r>
     </w:p>
     <w:p>
@@ -1854,7 +1868,7 @@
       <w:r>
         <w:drawing>
           <wp:inline distT="0" distB="0" distL="0" distR="0">
-            <wp:extent cx="3276600" cy="1943100"/>
+            <wp:extent cx="3276600" cy="2619375"/>
             <wp:effectExtent t="0" r="0" b="0" l="0"/>
             <wp:docPr id="1" name="" descr="" title=""/>
             <wp:cNvGraphicFramePr>
@@ -1879,7 +1893,7 @@
                   <pic:spPr bwMode="auto">
                     <a:xfrm>
                       <a:off x="0" y="0"/>
-                      <a:ext cx="3276600" cy="1943100"/>
+                      <a:ext cx="3276600" cy="2619375"/>
                     </a:xfrm>
                     <a:prstGeom prst="rect">
                       <a:avLst/>
@@ -1903,7 +1917,7 @@
           <w:sz w:val="16"/>
           <w:szCs w:val="16"/>
         </w:rPr>
-        <w:t xml:space="preserve">Fig. 3.  The same interface on a legitimate URL. Only long_url fires, giving a score of 10 and a Low Risk band. The single fired rule is still itemised, so a user can see that the score reflects length alone and no phishing vocabulary was matched.</w:t>
+        <w:t xml:space="preserve">Fig. 3.  Dashboard classifying a phishing URL that combines English lures with the Hindi/Telugu terms suraksha and khata. The verdict is accompanied by every rule that fired and its weight, and those weights sum to the reported score of 90.</w:t>
       </w:r>
     </w:p>
     <w:p>
@@ -1914,7 +1928,7 @@
       <w:r>
         <w:drawing>
           <wp:inline distT="0" distB="0" distL="0" distR="0">
-            <wp:extent cx="3276600" cy="1409700"/>
+            <wp:extent cx="3276600" cy="1943100"/>
             <wp:effectExtent t="0" r="0" b="0" l="0"/>
             <wp:docPr id="1" name="" descr="" title=""/>
             <wp:cNvGraphicFramePr>
@@ -1939,7 +1953,7 @@
                   <pic:spPr bwMode="auto">
                     <a:xfrm>
                       <a:off x="0" y="0"/>
-                      <a:ext cx="3276600" cy="1409700"/>
+                      <a:ext cx="3276600" cy="1943100"/>
                     </a:xfrm>
                     <a:prstGeom prst="rect">
                       <a:avLst/>
@@ -1963,7 +1977,7 @@
           <w:sz w:val="16"/>
           <w:szCs w:val="16"/>
         </w:rPr>
-        <w:t xml:space="preserve">Fig. 4.  Command-line output for the same two URLs. The command-line and dashboard front-ends call one scoring module, so their verdicts agree by construction; before the consolidation described in Section IV-A they did not.</w:t>
+        <w:t xml:space="preserve">Fig. 4.  The same interface on a legitimate URL. Only long_url fires, giving a score of 10 and a Low Risk band. The single fired rule is still itemised, so a user can see that the score reflects length alone and no phishing vocabulary was matched.</w:t>
       </w:r>
     </w:p>
     <w:p>
@@ -1974,7 +1988,7 @@
       <w:r>
         <w:drawing>
           <wp:inline distT="0" distB="0" distL="0" distR="0">
-            <wp:extent cx="3276600" cy="2781300"/>
+            <wp:extent cx="3276600" cy="1409700"/>
             <wp:effectExtent t="0" r="0" b="0" l="0"/>
             <wp:docPr id="1" name="" descr="" title=""/>
             <wp:cNvGraphicFramePr>
@@ -1999,6 +2013,66 @@
                   <pic:spPr bwMode="auto">
                     <a:xfrm>
                       <a:off x="0" y="0"/>
+                      <a:ext cx="3276600" cy="1409700"/>
+                    </a:xfrm>
+                    <a:prstGeom prst="rect">
+                      <a:avLst/>
+                    </a:prstGeom>
+                  </pic:spPr>
+                </pic:pic>
+              </a:graphicData>
+            </a:graphic>
+          </wp:inline>
+        </w:drawing>
+      </w:r>
+    </w:p>
+    <w:p>
+      <w:pPr>
+        <w:spacing w:after="140"/>
+        <w:jc w:val="left"/>
+      </w:pPr>
+      <w:r>
+        <w:rPr>
+          <w:rFonts w:ascii="Times New Roman" w:cs="Times New Roman" w:eastAsia="Times New Roman" w:hAnsi="Times New Roman"/>
+          <w:sz w:val="16"/>
+          <w:szCs w:val="16"/>
+        </w:rPr>
+        <w:t xml:space="preserve">Fig. 5.  Command-line output for the same two URLs. The command-line and dashboard front-ends call one scoring module, so their verdicts agree by construction; before the consolidation described in Section IV-A they did not.</w:t>
+      </w:r>
+    </w:p>
+    <w:p>
+      <w:pPr>
+        <w:spacing w:after="40" w:before="120"/>
+        <w:jc w:val="center"/>
+      </w:pPr>
+      <w:r>
+        <w:drawing>
+          <wp:inline distT="0" distB="0" distL="0" distR="0">
+            <wp:extent cx="3276600" cy="2781300"/>
+            <wp:effectExtent t="0" r="0" b="0" l="0"/>
+            <wp:docPr id="1" name="" descr="" title=""/>
+            <wp:cNvGraphicFramePr>
+              <a:graphicFrameLocks xmlns:a="http://schemas.openxmlformats.org/drawingml/2006/main" noChangeAspect="1"/>
+            </wp:cNvGraphicFramePr>
+            <a:graphic xmlns:a="http://schemas.openxmlformats.org/drawingml/2006/main">
+              <a:graphicData uri="http://schemas.openxmlformats.org/drawingml/2006/picture">
+                <pic:pic xmlns:pic="http://schemas.openxmlformats.org/drawingml/2006/picture">
+                  <pic:nvPicPr>
+                    <pic:cNvPr id="0" name="" descr=""/>
+                    <pic:cNvPicPr>
+                      <a:picLocks noChangeAspect="1" noChangeArrowheads="1"/>
+                    </pic:cNvPicPr>
+                  </pic:nvPicPr>
+                  <pic:blipFill>
+                    <a:blip r:embed="rId12" cstate="none"/>
+                    <a:srcRect/>
+                    <a:stretch>
+                      <a:fillRect/>
+                    </a:stretch>
+                  </pic:blipFill>
+                  <pic:spPr bwMode="auto">
+                    <a:xfrm>
+                      <a:off x="0" y="0"/>
                       <a:ext cx="3276600" cy="2781300"/>
                     </a:xfrm>
                     <a:prstGeom prst="rect">
@@ -2023,7 +2097,7 @@
           <w:sz w:val="16"/>
           <w:szCs w:val="16"/>
         </w:rPr>
-        <w:t xml:space="preserve">Fig. 5.  The accompanying file-integrity tool, which computes MD5, SHA-1 or SHA-256 digests and compares a generated digest against a reference. It is independent of the detector and is included for completeness.</w:t>
+        <w:t xml:space="preserve">Fig. 6.  The accompanying file-integrity tool, which computes MD5, SHA-1 or SHA-256 digests and compares a generated digest against a reference. It is independent of the detector and is included for completeness.</w:t>
       </w:r>
     </w:p>
     <w:p>
@@ -5923,7 +5997,7 @@
           <w:sz w:val="16"/>
           <w:szCs w:val="16"/>
         </w:rPr>
-        <w:t xml:space="preserve">Fig. 6.  Precision, recall and F1 across the full threshold range. The dotted line marks the operating threshold of 60.</w:t>
+        <w:t xml:space="preserve">Fig. 7.  Precision, recall and F1 across the full threshold range. The dotted line marks the operating threshold of 60.</w:t>
       </w:r>
     </w:p>
     <w:p>
@@ -5954,7 +6028,7 @@
           <w:sz w:val="16"/>
           <w:szCs w:val="16"/>
         </w:rPr>
-        <w:t xml:space="preserve">Fig. 7.  Rule-group ablation. The gap between the full rule set and the vocabulary-only variant is the contribution of the multilingual terms.</w:t>
+        <w:t xml:space="preserve">Fig. 8.  Rule-group ablation. The gap between the full rule set and the vocabulary-only variant is the contribution of the multilingual terms.</w:t>
       </w:r>
     </w:p>
     <w:p>
@@ -5985,7 +6059,7 @@
           <w:sz w:val="16"/>
           <w:szCs w:val="16"/>
         </w:rPr>
-        <w:t xml:space="preserve">Fig. 8.  Firing rate of each rule within each class. A rule that fires often on legitimate URLs is a source of false positives.</w:t>
+        <w:t xml:space="preserve">Fig. 9.  Firing rate of each rule within each class. A rule that fires often on legitimate URLs is a source of false positives.</w:t>
       </w:r>
     </w:p>
     <w:p>

</xml_diff>